<commit_message>
new version to review
</commit_message>
<xml_diff>
--- a/manuscript/tracked/DDI_revision_tracked.docx
+++ b/manuscript/tracked/DDI_revision_tracked.docx
@@ -948,7 +948,29 @@
           <w:sz w:val="24"/>
           <w:szCs w:val="24"/>
         </w:rPr>
-        <w:t xml:space="preserve">The Neotropics house nearly 40% of the global plant diversity in 13% of the terrestrial surface area (Raven et al., 2020). A particular contribution to this diversity comes from vascular epiphytes (VE), which contribute up to 39% of species in some regions (Taylor et al., 2021) and as much as 50% of species in some locations (Kelly et al., 2004). VE diversity and distribution have historically served as a model for biogeographic and macroecological patterns in the Neotropics, </w:t>
+        <w:t xml:space="preserve">
+          The Neotropics house nearly 40% of the global plant diversity in 13% of the terrestrial surface area (Raven et al., 2020). A particular contribution to this diversity comes from vascular epiphytes (VE), which contribute up to 39% of species in some regions (Taylor et al., 2021) and as much as 50% of species in some locations (Kelly et al., 2004). VE diversity and distribution have historically 
+          <w:del w:id="954" w:author="Copyeditor" w:date="2026-08-06T00:00:00Z">
+            <w:r>
+              <w:rPr>
+                <w:rFonts w:ascii="Times New Roman" w:eastAsia="Times New Roman" w:hAnsi="Times New Roman" w:cs="Times New Roman"/>
+                <w:sz w:val="24"/>
+                <w:szCs w:val="24"/>
+              </w:rPr>
+              <w:delText xml:space="preserve">served as a model for biogeographic and macroecological patterns in the Neotropics, </w:delText>
+            </w:r>
+          </w:del>
+          <w:ins w:id="955" w:author="Copyeditor" w:date="2026-08-06T00:00:00Z">
+            <w:r>
+              <w:rPr>
+                <w:rFonts w:ascii="Times New Roman" w:eastAsia="Times New Roman" w:hAnsi="Times New Roman" w:cs="Times New Roman"/>
+                <w:sz w:val="24"/>
+                <w:szCs w:val="24"/>
+              </w:rPr>
+              <w:t xml:space="preserve">served as a model system for studying plant diversity patterns, biogeographical processes, and data collection biases in the Neotropics, </w:t>
+            </w:r>
+          </w:ins>
+        </w:t>
       </w:r>
       <w:del w:id="11" w:author="Maria Carmona-Higuita" w:date="2026-08-05T00:00:00Z">
         <w:r>
@@ -1024,7 +1046,20 @@
           <w:sz w:val="24"/>
           <w:szCs w:val="24"/>
         </w:rPr>
-        <w:t xml:space="preserve"> (Benavides et al., 2005). Additionally, VE are essential parts of ecosystems in their own right, playing an important role in nutrient cycling and providing microhabitats for other organisms (Benzing, 1990; Woods et al., 2015).</w:t>
+        <w:t xml:space="preserve">
+           (Benavides et al., 2005). 
+          <w:ins w:id="204" w:author="Maria Carmona-Higuita" w:date="2026-08-06T00:00:00Z">
+            <w:r>
+              <w:rPr>
+                <w:rFonts w:ascii="Times New Roman" w:eastAsia="Times New Roman" w:hAnsi="Times New Roman" w:cs="Times New Roman"/>
+                <w:sz w:val="24"/>
+                <w:szCs w:val="24"/>
+              </w:rPr>
+              <w:t xml:space="preserve">Indeed, global analyses indicate that approximately half of angiosperm epiphyte species have small range sizes and qualify as rare (Svahnström et al., 2025), a pattern that amplifies both their ecological sensitivity and their underrepresentation in biodiversity databases. </w:t>
+            </w:r>
+          </w:ins>
+          Additionally, VE are essential parts of ecosystems in their own right, playing an important role in nutrient cycling and providing microhabitats for other organisms (Benzing, 1990; Woods et al., 2015).
+        </w:t>
       </w:r>
     </w:p>
     <w:p>
@@ -1559,7 +1594,30 @@
           <w:sz w:val="24"/>
           <w:szCs w:val="24"/>
         </w:rPr>
-        <w:t xml:space="preserve"> at the level of grid cells at 30 arc-minute resolution (ca. 55 km at the equator). We estimated the degree of completeness of each grid cell using the KnowBR package (Lobo et al. 2018; Guisande and Lobo 2019), which examines species accumulation by adding occurrence records. These </w:t>
+        <w:t xml:space="preserve">
+           at the level of grid cells at 
+          <w:del w:id="950" w:author="Copyeditor" w:date="2026-08-06T00:00:00Z">
+            <w:r>
+              <w:rPr>
+                <w:rFonts w:ascii="Times New Roman" w:eastAsia="Times New Roman" w:hAnsi="Times New Roman" w:cs="Times New Roman"/>
+                <w:sz w:val="24"/>
+                <w:szCs w:val="24"/>
+              </w:rPr>
+              <w:delText xml:space="preserve">30 arc-minute resolution (ca. 55 km at the equator).</w:delText>
+            </w:r>
+          </w:del>
+          <w:ins w:id="951" w:author="Copyeditor" w:date="2026-08-06T00:00:00Z">
+            <w:r>
+              <w:rPr>
+                <w:rFonts w:ascii="Times New Roman" w:eastAsia="Times New Roman" w:hAnsi="Times New Roman" w:cs="Times New Roman"/>
+                <w:sz w:val="24"/>
+                <w:szCs w:val="24"/>
+              </w:rPr>
+              <w:t xml:space="preserve">30 arc-minute resolution (ca. 55 km at the equator) — a scale standard in Neotropical macroecological analyses (Ramírez-Barahona et al., 2023) that balances spatial detail with data availability, ensuring sufficient records per cell for KnowBR estimation (see also Appendix S4 for 15 arc-minute sensitivity results).</w:t>
+            </w:r>
+          </w:ins>
+           We estimated the degree of completeness of each grid cell using the KnowBR package (Lobo et al. 2018; Guisande and Lobo 2019), which examines species accumulation by adding occurrence records. These 
+        </w:t>
       </w:r>
       <w:del w:id="922" w:author="Copyeditor" w:date="2026-08-06T00:00:00Z">
         <w:r>
@@ -1722,7 +1780,30 @@
           <w:sz w:val="24"/>
           <w:szCs w:val="24"/>
         </w:rPr>
-        <w:t>between the number of database records and the number of species. Completeness values (i.e. the percentage of species that have been documented over the total predicted) were calculated after adjusting the accumulation curves to a ran exponential model (Lobo et al. 2018).</w:t>
+        <w:t>
+          between the number of database records and the number of species. Completeness values (i.e. the percentage of species that have been documented over the total predicted) were calculated after adjusting the accumulation curves to 
+          <w:del w:id="960" w:author="Copyeditor" w:date="2026-08-06T00:00:00Z">
+            <w:r>
+              <w:rPr>
+                <w:rFonts w:ascii="Times New Roman" w:eastAsia="Times New Roman" w:hAnsi="Times New Roman" w:cs="Times New Roman"/>
+                <w:sz w:val="24"/>
+                <w:szCs w:val="24"/>
+              </w:rPr>
+              <w:delText xml:space="preserve">a ran exponential model</w:delText>
+            </w:r>
+          </w:del>
+          <w:ins w:id="961" w:author="Copyeditor" w:date="2026-08-06T00:00:00Z">
+            <w:r>
+              <w:rPr>
+                <w:rFonts w:ascii="Times New Roman" w:eastAsia="Times New Roman" w:hAnsi="Times New Roman" w:cs="Times New Roman"/>
+                <w:sz w:val="24"/>
+                <w:szCs w:val="24"/>
+              </w:rPr>
+              <w:t xml:space="preserve">a rational model</w:t>
+            </w:r>
+          </w:ins>
+           (Lobo et al. 2018).
+        </w:t>
       </w:r>
     </w:p>
     <w:p>
@@ -3193,6 +3274,16 @@
         </w:rPr>
         <w:t xml:space="preserve"> While tree and shrub inventories tend to be biased toward areas with greater accessibility, such as near roads, research stations, and protected areas (Feeley &amp; Silman, 2011; Tobler et al., 2007, Zizka et al., 2021), epiphyte data are further constrained by their canopy-dependent habit, and their three-dimensional distribution in the tree (Zotz, 2016), which makes their collection inherently more challenging than terrestrial species.</w:t>
       </w:r>
+      <w:ins w:id="205" w:author="Maria Carmona-Higuita" w:date="2026-08-06T00:00:00Z">
+        <w:r>
+          <w:rPr>
+            <w:rFonts w:ascii="Times New Roman" w:eastAsia="Times New Roman" w:hAnsi="Times New Roman" w:cs="Times New Roman"/>
+            <w:sz w:val="24"/>
+            <w:szCs w:val="24"/>
+          </w:rPr>
+          <w:t xml:space="preserve"> Additionally, many epiphyte species are inherently rare, with restricted geographic distributions (Svahnström et al., 2025), so even intensive surveys may systematically fail to detect them within standard sampling protocols.</w:t>
+        </w:r>
+      </w:ins>
     </w:p>
     <w:p>
       <w:pPr>
@@ -3378,7 +3469,40 @@
           <w:sz w:val="24"/>
           <w:szCs w:val="24"/>
         </w:rPr>
-        <w:t xml:space="preserve">, indicating a marked difference in how well these families are represented across the studied grid cells. This suggests that less represented families appear to be well sampled on average, but the overall taxonomic information available for Orchidaceae is broader, which could be advantageous for understanding its distribution and diversity across a larger spatial extent. The amount of information is particularly high in the charismatic and better represented families such as Orchidaceae and Bromeliaceae, largely due to focused collections (Garcillán &amp; Ezcurra, 2011; ter Steege et al., 2016) and the higher rate of description of new species (Cheek et al., 2020; Luján et al., 2023), nevertheless it frequently has a complex taxonomy (e.g., new name combinations; Schellenberger Costa et al., 2023). Although some epiphyte species grow to large sizes, many are very small and go unnoticed in un-directed </w:t>
+        <w:t xml:space="preserve">
+          , indicating a marked difference in how well these families are represented across the studied grid cells. 
+          <w:ins w:id="206" w:author="Maria Carmona-Higuita" w:date="2026-08-06T00:00:00Z">
+            <w:r>
+              <w:rPr>
+                <w:rFonts w:ascii="Times New Roman" w:eastAsia="Times New Roman" w:hAnsi="Times New Roman" w:cs="Times New Roman"/>
+                <w:sz w:val="24"/>
+                <w:szCs w:val="24"/>
+              </w:rPr>
+              <w:t xml:space="preserve">The pronounced shortfall in Orchidaceae may reflect the high proportion of rare, narrow-ranged species within this family (Svahnström et al., 2025; Vitt et al., 2023): with the greatest epiphytic species richness globally, Orchidaceae also harbours many species of restricted range and low local abundance, making them systematically harder to detect at the grid-cell scale. </w:t>
+            </w:r>
+          </w:ins>
+          <w:del w:id="964" w:author="Copyeditor" w:date="2026-08-06T00:00:00Z">
+            <w:r>
+              <w:rPr>
+                <w:rFonts w:ascii="Times New Roman" w:eastAsia="Times New Roman" w:hAnsi="Times New Roman" w:cs="Times New Roman"/>
+                <w:sz w:val="24"/>
+                <w:szCs w:val="24"/>
+              </w:rPr>
+              <w:delText xml:space="preserve">This suggests that less represented families appear to be well sampled on average, but the overall taxonomic information available for Orchidaceae is broader, which could be advantageous for understanding its distribution and diversity across a larger spatial extent.</w:delText>
+            </w:r>
+          </w:del>
+          <w:ins w:id="965" w:author="Copyeditor" w:date="2026-08-06T00:00:00Z">
+            <w:r>
+              <w:rPr>
+                <w:rFonts w:ascii="Times New Roman" w:eastAsia="Times New Roman" w:hAnsi="Times New Roman" w:cs="Times New Roman"/>
+                <w:sz w:val="24"/>
+                <w:szCs w:val="24"/>
+              </w:rPr>
+              <w:t xml:space="preserve">The apparent paradox — that Orchidaceae, the best-documented epiphyte family, shows the lowest completeness — reflects its extraordinary species richness: despite having more occurrence records in absolute terms, the gap between recorded and predicted species remains largest in Orchidaceae.</w:t>
+            </w:r>
+          </w:ins>
+           The amount of information is particularly high in the charismatic and better represented families such as Orchidaceae and Bromeliaceae, largely due to focused collections (Garcillán &amp; Ezcurra, 2011; ter Steege et al., 2016) and the higher rate of description of new species (Cheek et al., 2020; Luján et al., 2023), nevertheless it frequently has a complex taxonomy (e.g., new name combinations; Schellenberger Costa et al., 2023). Although some epiphyte species grow to large sizes, many are very small and go unnoticed in un-directed 
+        </w:t>
       </w:r>
       <w:r>
         <w:rPr>
@@ -3387,7 +3511,30 @@
           <w:szCs w:val="24"/>
         </w:rPr>
         <w:lastRenderedPageBreak/>
-        <w:t xml:space="preserve">sampling campaigns (Zotz, 2016). This pattern is especially pronounced in the Neotropics, where high species richness and complex taxonomy contribute to prolonged time lags in species description. For instance, the central Andes (southern Ecuador, Peru, western Bolivia, and northern and central Argentina and Chile) exhibit the longest time lags, while Chocó (western Colombia) has the shortest (Luján et al., 2023). In comparison with other life forms, trees for example also experience taxonomic shortfalls, nevertheless, these are particularly pronounced in epiphytes (Araujo et al., 2022; Araujo &amp; Ramos, 2021) due to the prevalence of cryptic species, high phenotypic plasticity, and reliance on specialists for accurate identification (Lees et al., 2020; Leite et al., 2013; Marin et al., 2008; Zotz, 2016). While trees and shrubs also suffer taxonomic uncertainties, especially in diverse families like Lauraceae and Myrtaceae (Meyer et al., 2016), epiphytes—particularly Orchidaceae—experience some of the highest rates of misidentifications and synonymization due to their intricate floral morphology and complex reproductive strategies (Freudenstein &amp; Chase, 2015). </w:t>
+        <w:t xml:space="preserve">
+          sampling campaigns (Zotz, 2016). This pattern is especially pronounced in the Neotropics, where high species richness and complex taxonomy contribute to prolonged time lags in species description. For instance, the central Andes (southern Ecuador, Peru, western Bolivia, and northern and central Argentina and Chile) exhibit the longest time lags, while Chocó (western Colombia) has the shortest (Luján et al., 2023). In comparison with other life forms, trees for example also experience taxonomic shortfalls, nevertheless, these are particularly pronounced in epiphytes (Araujo et al., 2022; Araujo &amp; Ramos, 2021) due to the prevalence of cryptic species, high phenotypic plasticity, and reliance on specialists for accurate identification (
+          <w:del w:id="952" w:author="Copyeditor" w:date="2026-08-06T00:00:00Z">
+            <w:r>
+              <w:rPr>
+                <w:rFonts w:ascii="Times New Roman" w:eastAsia="Times New Roman" w:hAnsi="Times New Roman" w:cs="Times New Roman"/>
+                <w:sz w:val="24"/>
+                <w:szCs w:val="24"/>
+              </w:rPr>
+              <w:delText xml:space="preserve">Lees et al., 2020; Leite et al., 2013; Marin et al., 2008; Zotz, 2016</w:delText>
+            </w:r>
+          </w:del>
+          <w:ins w:id="953" w:author="Copyeditor" w:date="2026-08-06T00:00:00Z">
+            <w:r>
+              <w:rPr>
+                <w:rFonts w:ascii="Times New Roman" w:eastAsia="Times New Roman" w:hAnsi="Times New Roman" w:cs="Times New Roman"/>
+                <w:sz w:val="24"/>
+                <w:szCs w:val="24"/>
+              </w:rPr>
+              <w:t xml:space="preserve">Marin et al., 2008; Mendieta-Leiva &amp; Zotz, 2015; Zotz, 2016</w:t>
+            </w:r>
+          </w:ins>
+          ). While trees and shrubs also suffer taxonomic uncertainties, especially in diverse families like Lauraceae and Myrtaceae (Meyer et al., 2016), epiphytes—particularly Orchidaceae—experience some of the highest rates of misidentifications and synonymization due to their intricate floral morphology and complex reproductive strategies (Freudenstein &amp; Chase, 2015). 
+        </w:t>
       </w:r>
     </w:p>
     <w:p>
@@ -3419,6 +3566,16 @@
           <w:t>documented regions globally even for trees, and our results indicate that vascular epiphytes face even greater data deficits — with only 1.1% of 30 arc-minute cells well-sampled using the slope-based proxy, compared to 18% of 100 km cells for trees globally. This gap is consistent with the known under-representation of epiphytes in botanical collections: epiphytic plants are systematically less collected than trees because they require specialised techniques, are absent from standard vegetation plots, and remain taxonomically challenging across most families (Gentry &amp; Dodson, 1987; Mendieta-Leiva et al., 2020; Ramos et al., 2019, 2024). These converging lines of evidence underscore the urgency of targeted epiphyte surveys across tropical South America, where high species diversity, low sampling completeness, and accelerating habitat loss create conditions of both high discovery potential and diminishing sampling opportunity (Chanachai et al., 2024).</w:t>
         </w:r>
       </w:ins>
+      <w:ins w:id="207" w:author="Maria Carmona-Higuita" w:date="2026-08-06T00:00:00Z">
+        <w:r>
+          <w:rPr>
+            <w:rFonts w:ascii="Times New Roman" w:eastAsia="Times New Roman" w:hAnsi="Times New Roman" w:cs="Times New Roman"/>
+            <w:sz w:val="24"/>
+            <w:szCs w:val="24"/>
+          </w:rPr>
+          <w:t xml:space="preserve"> These shortfalls are further compounded by the biology of epiphytes themselves: approximately half of angiosperm epiphyte species globally have small range sizes and are classified as rare (Svahnström et al., 2025), meaning that data incompleteness reflects not only sampling effort but also the inherent detectability constraints of the organisms. Global conservation prioritization frameworks for epiphytes, such as that developed for Orchidaceae (Vitt et al., 2023), may therefore be biased toward better-documented, widespread species — underscoring the need for targeted surveys before reliable conservation priorities can be established.</w:t>
+        </w:r>
+      </w:ins>
     </w:p>
     <w:p>
       <w:pPr>
@@ -3555,6 +3712,16 @@
           <w:t>Central America, the Amazonian region, and the Atlantic Forest of Brazil. These clusters reflect historical patterns of botanical sampling effort — where research infrastructure, accessibility, and longstanding herbaria have facilitated data accumulation — rather than areas of greatest biodiversity importance. The true priorities for future sampling correspond to the grid cells that remain entirely unsampled (white areas in Figures 1 and 2), representing vast areas across the Neotropics where no occurrence data exist for any of the five focal families. VE, with a high proportion of endemic (approx. 21%) and threatened species (1 in 6; Carmona-Higuita et al., 2023, 2025), is particularly vulnerable to the consequences of these knowledge gaps for conservation planning.</w:t>
         </w:r>
       </w:ins>
+      <w:ins w:id="208" w:author="Maria Carmona-Higuita" w:date="2026-08-06T00:00:00Z">
+        <w:r>
+          <w:rPr>
+            <w:rFonts w:ascii="Times New Roman" w:eastAsia="Times New Roman" w:hAnsi="Times New Roman" w:cs="Times New Roman"/>
+            <w:sz w:val="24"/>
+            <w:szCs w:val="24"/>
+          </w:rPr>
+          <w:t xml:space="preserve"> Even in relatively well-sampled provinces such as the Atlantic Forest, many epiphyte species have restricted distributions and high vulnerability to extinction (Leão et al., 2023), suggesting that improved data completeness does not guarantee adequate representation of narrow-ranged species.</w:t>
+        </w:r>
+      </w:ins>
     </w:p>
     <w:p>
       <w:pPr>
@@ -3627,7 +3794,39 @@
           <w:sz w:val="24"/>
           <w:szCs w:val="24"/>
         </w:rPr>
-        <w:t xml:space="preserve"> in epiphytic vascular plants, identifying priority areas and families that require further sampling efforts. We found severe under-sampling within key biodiversity regions either with a low number of records (Amazonia, Savannas and Southern Arid Zones), or for the biodiversity shortfalls (Mesoamerica and the Caribbean, Andes and Sub-Andean Regions and Eastern South American Forests), which limits our ability to accurately assess epiphyte diversity. Addressing these shortfalls is essential for improving biodiversity databases and ensuring that conservation strategies are based on accurate and representative data. Expanding targeted field explorations in under-sampled regions, including and describing shortfalls in other families, alongside the curation and mobilization of herbarium specimens, will be crucial to enhancing data completeness. Moreover, strengthening collaborative efforts among herbaria and research institutions will provide a more spatially balanced and taxonomically comprehensive picture of Neotropical epiphyte diversity. Such proactive approaches will enable better-informed conservation assessments and facilitate long-term studies on biodiversity responses to anthropogenic pressures.</w:t>
+        <w:t xml:space="preserve">
+           in epiphytic vascular plants, identifying priority areas and families that require further sampling efforts. We found severe under-sampling within key biodiversity regions either with a low number of records (Amazonia, Savannas and Southern Arid Zones), or for the biodiversity shortfalls (Mesoamerica and the Caribbean, Andes and Sub-Andean Regions and Eastern South American Forests), which limits our ability to accurately assess epiphyte diversity. Addressing these shortfalls is essential for improving biodiversity databases and ensuring that conservation strategies are based on accurate and representative data. Expanding targeted field explorations in under-sampled regions, including and describing shortfalls in other families, alongside the curation and mobilization of herbarium specimens, will be crucial to enhancing data completeness. Moreover, strengthening collaborative efforts among herbaria and research institutions will provide a more spatially balanced and taxonomically comprehensive picture of Neotropical epiphyte diversity. 
+          <w:ins w:id="209" w:author="Maria Carmona-Higuita" w:date="2026-08-06T00:00:00Z">
+            <w:r>
+              <w:rPr>
+                <w:rFonts w:ascii="Times New Roman" w:eastAsia="Times New Roman" w:hAnsi="Times New Roman" w:cs="Times New Roman"/>
+                <w:sz w:val="24"/>
+                <w:szCs w:val="24"/>
+              </w:rPr>
+              <w:t xml:space="preserve">Given that approximately half of angiosperm epiphyte species globally are rare with small range sizes (Svahnström et al., 2025), and that conservation prioritization for this group is still nascent (Vitt et al., 2023), addressing these data shortfalls is not merely a scientific priority — it is a prerequisite for effective conservation action. </w:t>
+            </w:r>
+          </w:ins>
+          <w:del w:id="966" w:author="Copyeditor" w:date="2026-08-06T00:00:00Z">
+            <w:r>
+              <w:rPr>
+                <w:rFonts w:ascii="Times New Roman" w:eastAsia="Times New Roman" w:hAnsi="Times New Roman" w:cs="Times New Roman"/>
+                <w:sz w:val="24"/>
+                <w:szCs w:val="24"/>
+              </w:rPr>
+              <w:delText xml:space="preserve">Such proactive approaches will enable better-informed conservation assessments and facilitate long-term studies on biodiversity responses to anthropogenic pressures.</w:delText>
+            </w:r>
+          </w:del>
+          <w:ins w:id="967" w:author="Copyeditor" w:date="2026-08-06T00:00:00Z">
+            <w:r>
+              <w:rPr>
+                <w:rFonts w:ascii="Times New Roman" w:eastAsia="Times New Roman" w:hAnsi="Times New Roman" w:cs="Times New Roman"/>
+                <w:sz w:val="24"/>
+                <w:szCs w:val="24"/>
+              </w:rPr>
+              <w:t xml:space="preserve">Such proactive approaches will enable more reliable conservation assessments and long-term monitoring of epiphyte responses to habitat loss and climate change.</w:t>
+            </w:r>
+          </w:ins>
+        </w:t>
       </w:r>
       <w:r>
         <w:rPr>
@@ -3676,7 +3875,30 @@
               <w:sz w:val="24"/>
               <w:szCs w:val="24"/>
             </w:rPr>
-            <w:t xml:space="preserve">Figure 1. Geographic distribution of epiphyte species records for the five most diverse epiphyte families in the Neotropics at a grid cell resolution of ≈ 55 km at the equator. The bivariate map shows species richness (x-axis) and number of occurrence records (y-axis) per grid cell, with values categorized into quartiles. Data were compiled from Carmona-Higuita et al., 2023 and mapped using the Behrmann projection. White cells indicate areas with no recorded occurrences. Areas with high record density generally coincide with high species richness, particularly in the Andes, Central America, and the Atlantic Forest, while some regions (e.g., the Amazon Basin) show relatively high species numbers with fewer records, suggesting potential under-sampling. </w:t>
+            <w:t xml:space="preserve">
+              Figure 1. Geographic distribution of epiphyte species records for the five most diverse epiphyte families in the Neotropics at a grid cell resolution of ≈ 55 km at the equator. The bivariate map shows species richness (x-axis) and number of occurrence records (y-axis) per grid cell, 
+              <w:del w:id="962" w:author="Copyeditor" w:date="2026-08-06T00:00:00Z">
+                <w:r>
+                  <w:rPr>
+                    <w:rFonts w:ascii="Times New Roman" w:eastAsia="Times New Roman" w:hAnsi="Times New Roman" w:cs="Times New Roman"/>
+                    <w:sz w:val="24"/>
+                    <w:szCs w:val="24"/>
+                  </w:rPr>
+                  <w:delText xml:space="preserve">with values categorized into quartiles</w:delText>
+                </w:r>
+              </w:del>
+              <w:ins w:id="963" w:author="Copyeditor" w:date="2026-08-06T00:00:00Z">
+                <w:r>
+                  <w:rPr>
+                    <w:rFonts w:ascii="Times New Roman" w:eastAsia="Times New Roman" w:hAnsi="Times New Roman" w:cs="Times New Roman"/>
+                    <w:sz w:val="24"/>
+                    <w:szCs w:val="24"/>
+                  </w:rPr>
+                  <w:t xml:space="preserve">with each axis divided into four equal-frequency classes for visualization</w:t>
+                </w:r>
+              </w:ins>
+              . Data were compiled from Carmona-Higuita et al., 2023 and mapped using the Behrmann projection. White cells indicate areas with no recorded occurrences. Areas with high record density generally coincide with high species richness, particularly in the Andes, Central America, and the Atlantic Forest, while some regions (e.g., the Amazon Basin) show relatively high species numbers with fewer records, suggesting potential under-sampling. 
+            </w:t>
           </w:r>
         </w:sdtContent>
       </w:sdt>
@@ -6889,75 +7111,39 @@
         <w:spacing w:after="0"/>
         <w:ind w:left="720" w:hanging="720"/>
         <w:rPr>
-          <w:rFonts w:ascii="Times New Roman" w:eastAsia="Times New Roman" w:hAnsi="Times New Roman" w:cs="Times New Roman"/>
-          <w:sz w:val="24"/>
-          <w:szCs w:val="24"/>
-          <w:lang w:val="es-ES"/>
-        </w:rPr>
-      </w:pPr>
-      <w:r>
-        <w:rPr>
-          <w:rFonts w:ascii="Times New Roman" w:eastAsia="Times New Roman" w:hAnsi="Times New Roman" w:cs="Times New Roman"/>
-          <w:sz w:val="24"/>
-          <w:szCs w:val="24"/>
-        </w:rPr>
-        <w:t xml:space="preserve">Leite, G. A., Pinheiro, R. T., Marcelino, D. G., Figueira, J. E. C., &amp; Delabie, J. H. C. (2013). Foraging Behavior of Kaempfer’s Woodpecker ( </w:t>
-      </w:r>
-      <w:r>
-        <w:rPr>
-          <w:rFonts w:ascii="Times New Roman" w:eastAsia="Times New Roman" w:hAnsi="Times New Roman" w:cs="Times New Roman"/>
-          <w:i/>
-          <w:sz w:val="24"/>
-          <w:szCs w:val="24"/>
-        </w:rPr>
-        <w:t>Celeus obrieni</w:t>
-      </w:r>
-      <w:r>
-        <w:rPr>
-          <w:rFonts w:ascii="Times New Roman" w:eastAsia="Times New Roman" w:hAnsi="Times New Roman" w:cs="Times New Roman"/>
-          <w:sz w:val="24"/>
-          <w:szCs w:val="24"/>
-        </w:rPr>
-        <w:t xml:space="preserve"> ), a Bamboo Specialist. </w:t>
-      </w:r>
-      <w:r>
-        <w:rPr>
-          <w:rFonts w:ascii="Times New Roman" w:eastAsia="Times New Roman" w:hAnsi="Times New Roman" w:cs="Times New Roman"/>
-          <w:i/>
-          <w:sz w:val="24"/>
-          <w:szCs w:val="24"/>
-          <w:lang w:val="es-ES"/>
-        </w:rPr>
-        <w:t>The Condor</w:t>
-      </w:r>
-      <w:r>
-        <w:rPr>
-          <w:rFonts w:ascii="Times New Roman" w:eastAsia="Times New Roman" w:hAnsi="Times New Roman" w:cs="Times New Roman"/>
-          <w:sz w:val="24"/>
-          <w:szCs w:val="24"/>
-          <w:lang w:val="es-ES"/>
-        </w:rPr>
-        <w:t xml:space="preserve">, </w:t>
-      </w:r>
-      <w:r>
-        <w:rPr>
-          <w:rFonts w:ascii="Times New Roman" w:eastAsia="Times New Roman" w:hAnsi="Times New Roman" w:cs="Times New Roman"/>
-          <w:i/>
-          <w:sz w:val="24"/>
-          <w:szCs w:val="24"/>
-          <w:lang w:val="es-ES"/>
-        </w:rPr>
-        <w:t>115</w:t>
-      </w:r>
-      <w:r>
-        <w:rPr>
-          <w:rFonts w:ascii="Times New Roman" w:eastAsia="Times New Roman" w:hAnsi="Times New Roman" w:cs="Times New Roman"/>
-          <w:sz w:val="24"/>
-          <w:szCs w:val="24"/>
-          <w:lang w:val="es-ES"/>
-        </w:rPr>
-        <w:t>(2), 221–229. https://doi.org/10.1525/cond.2013.120062</w:t>
-      </w:r>
+          <w:ins w:id="200" w:author="Maria Carmona-Higuita" w:date="2026-08-06T00:00:00Z"/>
+          <w:rFonts w:ascii="Times New Roman" w:eastAsia="Times New Roman" w:hAnsi="Times New Roman" w:cs="Times New Roman"/>
+          <w:sz w:val="24"/>
+          <w:szCs w:val="24"/>
+        </w:rPr>
+      </w:pPr>
+      <w:ins w:id="201" w:author="Maria Carmona-Higuita" w:date="2026-08-06T00:00:00Z">
+        <w:r>
+          <w:rPr>
+            <w:rFonts w:ascii="Times New Roman" w:eastAsia="Times New Roman" w:hAnsi="Times New Roman" w:cs="Times New Roman"/>
+            <w:sz w:val="24"/>
+            <w:szCs w:val="24"/>
+          </w:rPr>
+          <w:t xml:space="preserve">Leão, T. C. C., Reich, P. B., &amp; Nic Lughadha, E. (2023). The geographic range size and vulnerability to extinction of angiosperm epiphytes in the Atlantic Forest of Brazil. </w:t>
+        </w:r>
+        <w:r>
+          <w:rPr>
+            <w:rFonts w:ascii="Times New Roman" w:eastAsia="Times New Roman" w:hAnsi="Times New Roman" w:cs="Times New Roman"/>
+            <w:i/>
+            <w:sz w:val="24"/>
+            <w:szCs w:val="24"/>
+          </w:rPr>
+          <w:t xml:space="preserve">Global Ecology and Biogeography</w:t>
+        </w:r>
+        <w:r>
+          <w:rPr>
+            <w:rFonts w:ascii="Times New Roman" w:eastAsia="Times New Roman" w:hAnsi="Times New Roman" w:cs="Times New Roman"/>
+            <w:sz w:val="24"/>
+            <w:szCs w:val="24"/>
+          </w:rPr>
+          <w:t xml:space="preserve">, 32, 1607–1617. https://doi.org/10.1111/geb.13718</w:t>
+        </w:r>
+      </w:ins>
     </w:p>
     <w:p>
       <w:pPr>
@@ -6974,40 +7160,50 @@
           <w:rFonts w:ascii="Times New Roman" w:eastAsia="Times New Roman" w:hAnsi="Times New Roman" w:cs="Times New Roman"/>
           <w:sz w:val="24"/>
           <w:szCs w:val="24"/>
-        </w:rPr>
-      </w:pPr>
-      <w:r>
-        <w:rPr>
-          <w:rFonts w:ascii="Times New Roman" w:eastAsia="Times New Roman" w:hAnsi="Times New Roman" w:cs="Times New Roman"/>
-          <w:sz w:val="24"/>
-          <w:szCs w:val="24"/>
           <w:lang w:val="es-ES"/>
         </w:rPr>
-        <w:lastRenderedPageBreak/>
-        <w:t xml:space="preserve">Lobo, J. M., Hortal, J., Yela, J. L., Millán, A., Sánchez-Fernández, D., García-Roselló, E., González-Dacosta, J., Heine, J., González-Vilas, L., &amp; Guisande, C. (2018). </w:t>
-      </w:r>
-      <w:r>
-        <w:rPr>
-          <w:rFonts w:ascii="Times New Roman" w:eastAsia="Times New Roman" w:hAnsi="Times New Roman" w:cs="Times New Roman"/>
-          <w:sz w:val="24"/>
-          <w:szCs w:val="24"/>
-        </w:rPr>
-        <w:t xml:space="preserve">KnowBR: An application to map the geographical variation of survey effort and identify well-surveyed areas from biodiversity databases. </w:t>
-      </w:r>
-      <w:r>
-        <w:rPr>
-          <w:rFonts w:ascii="Times New Roman" w:eastAsia="Times New Roman" w:hAnsi="Times New Roman" w:cs="Times New Roman"/>
-          <w:i/>
-          <w:sz w:val="24"/>
-          <w:szCs w:val="24"/>
-        </w:rPr>
-        <w:t>Ecological Indicators</w:t>
-      </w:r>
-      <w:r>
-        <w:rPr>
-          <w:rFonts w:ascii="Times New Roman" w:eastAsia="Times New Roman" w:hAnsi="Times New Roman" w:cs="Times New Roman"/>
-          <w:sz w:val="24"/>
-          <w:szCs w:val="24"/>
+      </w:pPr>
+      <w:r>
+        <w:rPr>
+          <w:rFonts w:ascii="Times New Roman" w:eastAsia="Times New Roman" w:hAnsi="Times New Roman" w:cs="Times New Roman"/>
+          <w:sz w:val="24"/>
+          <w:szCs w:val="24"/>
+        </w:rPr>
+        <w:t xml:space="preserve">Leite, G. A., Pinheiro, R. T., Marcelino, D. G., Figueira, J. E. C., &amp; Delabie, J. H. C. (2013). Foraging Behavior of Kaempfer’s Woodpecker ( </w:t>
+      </w:r>
+      <w:r>
+        <w:rPr>
+          <w:rFonts w:ascii="Times New Roman" w:eastAsia="Times New Roman" w:hAnsi="Times New Roman" w:cs="Times New Roman"/>
+          <w:i/>
+          <w:sz w:val="24"/>
+          <w:szCs w:val="24"/>
+        </w:rPr>
+        <w:t>Celeus obrieni</w:t>
+      </w:r>
+      <w:r>
+        <w:rPr>
+          <w:rFonts w:ascii="Times New Roman" w:eastAsia="Times New Roman" w:hAnsi="Times New Roman" w:cs="Times New Roman"/>
+          <w:sz w:val="24"/>
+          <w:szCs w:val="24"/>
+        </w:rPr>
+        <w:t xml:space="preserve"> ), a Bamboo Specialist. </w:t>
+      </w:r>
+      <w:r>
+        <w:rPr>
+          <w:rFonts w:ascii="Times New Roman" w:eastAsia="Times New Roman" w:hAnsi="Times New Roman" w:cs="Times New Roman"/>
+          <w:i/>
+          <w:sz w:val="24"/>
+          <w:szCs w:val="24"/>
+          <w:lang w:val="es-ES"/>
+        </w:rPr>
+        <w:t>The Condor</w:t>
+      </w:r>
+      <w:r>
+        <w:rPr>
+          <w:rFonts w:ascii="Times New Roman" w:eastAsia="Times New Roman" w:hAnsi="Times New Roman" w:cs="Times New Roman"/>
+          <w:sz w:val="24"/>
+          <w:szCs w:val="24"/>
+          <w:lang w:val="es-ES"/>
         </w:rPr>
         <w:t xml:space="preserve">, </w:t>
       </w:r>
@@ -7017,16 +7213,18 @@
           <w:i/>
           <w:sz w:val="24"/>
           <w:szCs w:val="24"/>
-        </w:rPr>
-        <w:t>91</w:t>
-      </w:r>
-      <w:r>
-        <w:rPr>
-          <w:rFonts w:ascii="Times New Roman" w:eastAsia="Times New Roman" w:hAnsi="Times New Roman" w:cs="Times New Roman"/>
-          <w:sz w:val="24"/>
-          <w:szCs w:val="24"/>
-        </w:rPr>
-        <w:t>, 241–248. https://doi.org/10.1016/j.ecolind.2018.03.077</w:t>
+          <w:lang w:val="es-ES"/>
+        </w:rPr>
+        <w:t>115</w:t>
+      </w:r>
+      <w:r>
+        <w:rPr>
+          <w:rFonts w:ascii="Times New Roman" w:eastAsia="Times New Roman" w:hAnsi="Times New Roman" w:cs="Times New Roman"/>
+          <w:sz w:val="24"/>
+          <w:szCs w:val="24"/>
+          <w:lang w:val="es-ES"/>
+        </w:rPr>
+        <w:t>(2), 221–229. https://doi.org/10.1525/cond.2013.120062</w:t>
       </w:r>
     </w:p>
     <w:p>
@@ -7051,44 +7249,52 @@
           <w:rFonts w:ascii="Times New Roman" w:eastAsia="Times New Roman" w:hAnsi="Times New Roman" w:cs="Times New Roman"/>
           <w:sz w:val="24"/>
           <w:szCs w:val="24"/>
-        </w:rPr>
-        <w:t xml:space="preserve">Lomolino, M. V. (2004). Conservation biogeography. </w:t>
-      </w:r>
-      <w:r>
-        <w:rPr>
-          <w:rFonts w:ascii="Times New Roman" w:eastAsia="Times New Roman" w:hAnsi="Times New Roman" w:cs="Times New Roman"/>
-          <w:sz w:val="24"/>
-          <w:szCs w:val="24"/>
-          <w:lang w:val="it-IT"/>
-        </w:rPr>
-        <w:t xml:space="preserve">In </w:t>
-      </w:r>
-      <w:r>
-        <w:rPr>
-          <w:rFonts w:ascii="Times New Roman" w:eastAsia="Times New Roman" w:hAnsi="Times New Roman" w:cs="Times New Roman"/>
-          <w:i/>
-          <w:sz w:val="24"/>
-          <w:szCs w:val="24"/>
-          <w:lang w:val="it-IT"/>
-        </w:rPr>
-        <w:t xml:space="preserve">Lomolino, L. R. Heaney. </w:t>
-      </w:r>
-      <w:r>
-        <w:rPr>
-          <w:rFonts w:ascii="Times New Roman" w:eastAsia="Times New Roman" w:hAnsi="Times New Roman" w:cs="Times New Roman"/>
-          <w:i/>
-          <w:sz w:val="24"/>
-          <w:szCs w:val="24"/>
-        </w:rPr>
-        <w:t>2004. Frontiers of Biogeography: New Directions in the Geography of Nature.</w:t>
-      </w:r>
-      <w:r>
-        <w:rPr>
-          <w:rFonts w:ascii="Times New Roman" w:eastAsia="Times New Roman" w:hAnsi="Times New Roman" w:cs="Times New Roman"/>
-          <w:sz w:val="24"/>
-          <w:szCs w:val="24"/>
-        </w:rPr>
-        <w:t xml:space="preserve"> (p. 293). Sinauer Associates, Inc.</w:t>
+          <w:lang w:val="es-ES"/>
+        </w:rPr>
+        <w:lastRenderedPageBreak/>
+        <w:t xml:space="preserve">Lobo, J. M., Hortal, J., Yela, J. L., Millán, A., Sánchez-Fernández, D., García-Roselló, E., González-Dacosta, J., Heine, J., González-Vilas, L., &amp; Guisande, C. (2018). </w:t>
+      </w:r>
+      <w:r>
+        <w:rPr>
+          <w:rFonts w:ascii="Times New Roman" w:eastAsia="Times New Roman" w:hAnsi="Times New Roman" w:cs="Times New Roman"/>
+          <w:sz w:val="24"/>
+          <w:szCs w:val="24"/>
+        </w:rPr>
+        <w:t xml:space="preserve">KnowBR: An application to map the geographical variation of survey effort and identify well-surveyed areas from biodiversity databases. </w:t>
+      </w:r>
+      <w:r>
+        <w:rPr>
+          <w:rFonts w:ascii="Times New Roman" w:eastAsia="Times New Roman" w:hAnsi="Times New Roman" w:cs="Times New Roman"/>
+          <w:i/>
+          <w:sz w:val="24"/>
+          <w:szCs w:val="24"/>
+        </w:rPr>
+        <w:t>Ecological Indicators</w:t>
+      </w:r>
+      <w:r>
+        <w:rPr>
+          <w:rFonts w:ascii="Times New Roman" w:eastAsia="Times New Roman" w:hAnsi="Times New Roman" w:cs="Times New Roman"/>
+          <w:sz w:val="24"/>
+          <w:szCs w:val="24"/>
+        </w:rPr>
+        <w:t xml:space="preserve">, </w:t>
+      </w:r>
+      <w:r>
+        <w:rPr>
+          <w:rFonts w:ascii="Times New Roman" w:eastAsia="Times New Roman" w:hAnsi="Times New Roman" w:cs="Times New Roman"/>
+          <w:i/>
+          <w:sz w:val="24"/>
+          <w:szCs w:val="24"/>
+        </w:rPr>
+        <w:t>91</w:t>
+      </w:r>
+      <w:r>
+        <w:rPr>
+          <w:rFonts w:ascii="Times New Roman" w:eastAsia="Times New Roman" w:hAnsi="Times New Roman" w:cs="Times New Roman"/>
+          <w:sz w:val="24"/>
+          <w:szCs w:val="24"/>
+        </w:rPr>
+        <w:t>, 241–248. https://doi.org/10.1016/j.ecolind.2018.03.077</w:t>
       </w:r>
     </w:p>
     <w:p>
@@ -7114,24 +7320,43 @@
           <w:sz w:val="24"/>
           <w:szCs w:val="24"/>
         </w:rPr>
-        <w:t xml:space="preserve">Luján, M., Lemos, R. M., Lucas, E., Michelangeli, F. A., Prance, G., Pennington, T. D., Rzedowski, J., Santamaría-Aguilar, D., Serpell, E., Sothers, C., &amp; Zuntini, A. R. (2023). </w:t>
-      </w:r>
-      <w:r>
-        <w:rPr>
-          <w:rFonts w:ascii="Times New Roman" w:eastAsia="Times New Roman" w:hAnsi="Times New Roman" w:cs="Times New Roman"/>
-          <w:i/>
-          <w:sz w:val="24"/>
-          <w:szCs w:val="24"/>
-        </w:rPr>
-        <w:t>Trials and tribulations of Neotropical plant taxonomy: Pace of tree species description</w:t>
-      </w:r>
-      <w:r>
-        <w:rPr>
-          <w:rFonts w:ascii="Times New Roman" w:eastAsia="Times New Roman" w:hAnsi="Times New Roman" w:cs="Times New Roman"/>
-          <w:sz w:val="24"/>
-          <w:szCs w:val="24"/>
-        </w:rPr>
-        <w:t>. Plant Biology. https://doi.org/10.1101/2023.09.05.556231</w:t>
+        <w:t xml:space="preserve">Lomolino, M. V. (2004). Conservation biogeography. </w:t>
+      </w:r>
+      <w:r>
+        <w:rPr>
+          <w:rFonts w:ascii="Times New Roman" w:eastAsia="Times New Roman" w:hAnsi="Times New Roman" w:cs="Times New Roman"/>
+          <w:sz w:val="24"/>
+          <w:szCs w:val="24"/>
+          <w:lang w:val="it-IT"/>
+        </w:rPr>
+        <w:t xml:space="preserve">In </w:t>
+      </w:r>
+      <w:r>
+        <w:rPr>
+          <w:rFonts w:ascii="Times New Roman" w:eastAsia="Times New Roman" w:hAnsi="Times New Roman" w:cs="Times New Roman"/>
+          <w:i/>
+          <w:sz w:val="24"/>
+          <w:szCs w:val="24"/>
+          <w:lang w:val="it-IT"/>
+        </w:rPr>
+        <w:t xml:space="preserve">Lomolino, L. R. Heaney. </w:t>
+      </w:r>
+      <w:r>
+        <w:rPr>
+          <w:rFonts w:ascii="Times New Roman" w:eastAsia="Times New Roman" w:hAnsi="Times New Roman" w:cs="Times New Roman"/>
+          <w:i/>
+          <w:sz w:val="24"/>
+          <w:szCs w:val="24"/>
+        </w:rPr>
+        <w:t>2004. Frontiers of Biogeography: New Directions in the Geography of Nature.</w:t>
+      </w:r>
+      <w:r>
+        <w:rPr>
+          <w:rFonts w:ascii="Times New Roman" w:eastAsia="Times New Roman" w:hAnsi="Times New Roman" w:cs="Times New Roman"/>
+          <w:sz w:val="24"/>
+          <w:szCs w:val="24"/>
+        </w:rPr>
+        <w:t xml:space="preserve"> (p. 293). Sinauer Associates, Inc.</w:t>
       </w:r>
     </w:p>
     <w:p>
@@ -7157,41 +7382,24 @@
           <w:sz w:val="24"/>
           <w:szCs w:val="24"/>
         </w:rPr>
-        <w:t xml:space="preserve">Maldonado, C., Molina, C. I., Zizka, A., Persson, C., Taylor, C. M., Albán, J., Chilquillo, E., Rønsted, N., &amp; Antonelli, A. (2015). Estimating species diversity and distribution in the era of Big Data: To what extent can we trust public databases? </w:t>
-      </w:r>
-      <w:r>
-        <w:rPr>
-          <w:rFonts w:ascii="Times New Roman" w:eastAsia="Times New Roman" w:hAnsi="Times New Roman" w:cs="Times New Roman"/>
-          <w:i/>
-          <w:sz w:val="24"/>
-          <w:szCs w:val="24"/>
-        </w:rPr>
-        <w:t>Global Ecology and Biogeography</w:t>
-      </w:r>
-      <w:r>
-        <w:rPr>
-          <w:rFonts w:ascii="Times New Roman" w:eastAsia="Times New Roman" w:hAnsi="Times New Roman" w:cs="Times New Roman"/>
-          <w:sz w:val="24"/>
-          <w:szCs w:val="24"/>
-        </w:rPr>
-        <w:t xml:space="preserve">, </w:t>
-      </w:r>
-      <w:r>
-        <w:rPr>
-          <w:rFonts w:ascii="Times New Roman" w:eastAsia="Times New Roman" w:hAnsi="Times New Roman" w:cs="Times New Roman"/>
-          <w:i/>
-          <w:sz w:val="24"/>
-          <w:szCs w:val="24"/>
-        </w:rPr>
-        <w:t>24</w:t>
-      </w:r>
-      <w:r>
-        <w:rPr>
-          <w:rFonts w:ascii="Times New Roman" w:eastAsia="Times New Roman" w:hAnsi="Times New Roman" w:cs="Times New Roman"/>
-          <w:sz w:val="24"/>
-          <w:szCs w:val="24"/>
-        </w:rPr>
-        <w:t>(8), 973–984. https://doi.org/10.1111/geb.12326</w:t>
+        <w:t xml:space="preserve">Luján, M., Lemos, R. M., Lucas, E., Michelangeli, F. A., Prance, G., Pennington, T. D., Rzedowski, J., Santamaría-Aguilar, D., Serpell, E., Sothers, C., &amp; Zuntini, A. R. (2023). </w:t>
+      </w:r>
+      <w:r>
+        <w:rPr>
+          <w:rFonts w:ascii="Times New Roman" w:eastAsia="Times New Roman" w:hAnsi="Times New Roman" w:cs="Times New Roman"/>
+          <w:i/>
+          <w:sz w:val="24"/>
+          <w:szCs w:val="24"/>
+        </w:rPr>
+        <w:t>Trials and tribulations of Neotropical plant taxonomy: Pace of tree species description</w:t>
+      </w:r>
+      <w:r>
+        <w:rPr>
+          <w:rFonts w:ascii="Times New Roman" w:eastAsia="Times New Roman" w:hAnsi="Times New Roman" w:cs="Times New Roman"/>
+          <w:sz w:val="24"/>
+          <w:szCs w:val="24"/>
+        </w:rPr>
+        <w:t>. Plant Biology. https://doi.org/10.1101/2023.09.05.556231</w:t>
       </w:r>
     </w:p>
     <w:p>
@@ -7217,16 +7425,16 @@
           <w:sz w:val="24"/>
           <w:szCs w:val="24"/>
         </w:rPr>
-        <w:t xml:space="preserve">Marin, A. C., Wolf, J. H. D., Oostermeijer, J. G. B., &amp; den Nijs, J. C. M. (2008). Establishment of Epiphytic Bromeliads in Successional Tropical Premontane Forests in Costa Rica. </w:t>
-      </w:r>
-      <w:r>
-        <w:rPr>
-          <w:rFonts w:ascii="Times New Roman" w:eastAsia="Times New Roman" w:hAnsi="Times New Roman" w:cs="Times New Roman"/>
-          <w:i/>
-          <w:sz w:val="24"/>
-          <w:szCs w:val="24"/>
-        </w:rPr>
-        <w:t>Biotropica</w:t>
+        <w:t xml:space="preserve">Maldonado, C., Molina, C. I., Zizka, A., Persson, C., Taylor, C. M., Albán, J., Chilquillo, E., Rønsted, N., &amp; Antonelli, A. (2015). Estimating species diversity and distribution in the era of Big Data: To what extent can we trust public databases? </w:t>
+      </w:r>
+      <w:r>
+        <w:rPr>
+          <w:rFonts w:ascii="Times New Roman" w:eastAsia="Times New Roman" w:hAnsi="Times New Roman" w:cs="Times New Roman"/>
+          <w:i/>
+          <w:sz w:val="24"/>
+          <w:szCs w:val="24"/>
+        </w:rPr>
+        <w:t>Global Ecology and Biogeography</w:t>
       </w:r>
       <w:r>
         <w:rPr>
@@ -7243,15 +7451,15 @@
           <w:sz w:val="24"/>
           <w:szCs w:val="24"/>
         </w:rPr>
-        <w:t>40</w:t>
-      </w:r>
-      <w:r>
-        <w:rPr>
-          <w:rFonts w:ascii="Times New Roman" w:eastAsia="Times New Roman" w:hAnsi="Times New Roman" w:cs="Times New Roman"/>
-          <w:sz w:val="24"/>
-          <w:szCs w:val="24"/>
-        </w:rPr>
-        <w:t>(4), 441–448.</w:t>
+        <w:t>24</w:t>
+      </w:r>
+      <w:r>
+        <w:rPr>
+          <w:rFonts w:ascii="Times New Roman" w:eastAsia="Times New Roman" w:hAnsi="Times New Roman" w:cs="Times New Roman"/>
+          <w:sz w:val="24"/>
+          <w:szCs w:val="24"/>
+        </w:rPr>
+        <w:t>(8), 973–984. https://doi.org/10.1111/geb.12326</w:t>
       </w:r>
     </w:p>
     <w:p>
@@ -7277,17 +7485,16 @@
           <w:sz w:val="24"/>
           <w:szCs w:val="24"/>
         </w:rPr>
-        <w:lastRenderedPageBreak/>
-        <w:t xml:space="preserve">Mendieta-Leiva, G., Ramos, F. N., Elias, J. P. C., Zotz, G., Acuña-Tarazona, M., Alvim, F. S., Barbosa, D. E. F., Basílio, G. A., Batke, S. P., Benavides, A. M., Blum, C. T., Boelter, C. R., Brancalion, P. H. S., Carmona, M. J., Carvalho, L. P., de la Rosa-Manzano, E., Einzmann, H. J. R., Fernández, M., Furtado, S. G., … Jiménez-Alfaro, B. (2020). EpIG-DB: A database of vascular epiphyte assemblages in the Neotropics. </w:t>
-      </w:r>
-      <w:r>
-        <w:rPr>
-          <w:rFonts w:ascii="Times New Roman" w:eastAsia="Times New Roman" w:hAnsi="Times New Roman" w:cs="Times New Roman"/>
-          <w:i/>
-          <w:sz w:val="24"/>
-          <w:szCs w:val="24"/>
-        </w:rPr>
-        <w:t>Journal of Vegetation Science</w:t>
+        <w:t xml:space="preserve">Marin, A. C., Wolf, J. H. D., Oostermeijer, J. G. B., &amp; den Nijs, J. C. M. (2008). Establishment of Epiphytic Bromeliads in Successional Tropical Premontane Forests in Costa Rica. </w:t>
+      </w:r>
+      <w:r>
+        <w:rPr>
+          <w:rFonts w:ascii="Times New Roman" w:eastAsia="Times New Roman" w:hAnsi="Times New Roman" w:cs="Times New Roman"/>
+          <w:i/>
+          <w:sz w:val="24"/>
+          <w:szCs w:val="24"/>
+        </w:rPr>
+        <w:t>Biotropica</w:t>
       </w:r>
       <w:r>
         <w:rPr>
@@ -7304,15 +7511,15 @@
           <w:sz w:val="24"/>
           <w:szCs w:val="24"/>
         </w:rPr>
-        <w:t>31</w:t>
-      </w:r>
-      <w:r>
-        <w:rPr>
-          <w:rFonts w:ascii="Times New Roman" w:eastAsia="Times New Roman" w:hAnsi="Times New Roman" w:cs="Times New Roman"/>
-          <w:sz w:val="24"/>
-          <w:szCs w:val="24"/>
-        </w:rPr>
-        <w:t>(3), 1–11. https://doi.org/10.1111/jvs.12867</w:t>
+        <w:t>40</w:t>
+      </w:r>
+      <w:r>
+        <w:rPr>
+          <w:rFonts w:ascii="Times New Roman" w:eastAsia="Times New Roman" w:hAnsi="Times New Roman" w:cs="Times New Roman"/>
+          <w:sz w:val="24"/>
+          <w:szCs w:val="24"/>
+        </w:rPr>
+        <w:t>(4), 441–448.</w:t>
       </w:r>
     </w:p>
     <w:p>
@@ -7338,16 +7545,17 @@
           <w:sz w:val="24"/>
           <w:szCs w:val="24"/>
         </w:rPr>
-        <w:t xml:space="preserve">Mendieta-Leiva, G., &amp; Zotz, G. (2015). A conceptual framework for the analysis of vascular epiphyte assemblages. </w:t>
-      </w:r>
-      <w:r>
-        <w:rPr>
-          <w:rFonts w:ascii="Times New Roman" w:eastAsia="Times New Roman" w:hAnsi="Times New Roman" w:cs="Times New Roman"/>
-          <w:i/>
-          <w:sz w:val="24"/>
-          <w:szCs w:val="24"/>
-        </w:rPr>
-        <w:t>Perspectives in Plant Ecology, Evolution and Systematics</w:t>
+        <w:lastRenderedPageBreak/>
+        <w:t xml:space="preserve">Mendieta-Leiva, G., Ramos, F. N., Elias, J. P. C., Zotz, G., Acuña-Tarazona, M., Alvim, F. S., Barbosa, D. E. F., Basílio, G. A., Batke, S. P., Benavides, A. M., Blum, C. T., Boelter, C. R., Brancalion, P. H. S., Carmona, M. J., Carvalho, L. P., de la Rosa-Manzano, E., Einzmann, H. J. R., Fernández, M., Furtado, S. G., … Jiménez-Alfaro, B. (2020). EpIG-DB: A database of vascular epiphyte assemblages in the Neotropics. </w:t>
+      </w:r>
+      <w:r>
+        <w:rPr>
+          <w:rFonts w:ascii="Times New Roman" w:eastAsia="Times New Roman" w:hAnsi="Times New Roman" w:cs="Times New Roman"/>
+          <w:i/>
+          <w:sz w:val="24"/>
+          <w:szCs w:val="24"/>
+        </w:rPr>
+        <w:t>Journal of Vegetation Science</w:t>
       </w:r>
       <w:r>
         <w:rPr>
@@ -7364,15 +7572,15 @@
           <w:sz w:val="24"/>
           <w:szCs w:val="24"/>
         </w:rPr>
-        <w:t>17</w:t>
-      </w:r>
-      <w:r>
-        <w:rPr>
-          <w:rFonts w:ascii="Times New Roman" w:eastAsia="Times New Roman" w:hAnsi="Times New Roman" w:cs="Times New Roman"/>
-          <w:sz w:val="24"/>
-          <w:szCs w:val="24"/>
-        </w:rPr>
-        <w:t>(6), 510–521. https://doi.org/10.1016/j.ppees.2015.09.003</w:t>
+        <w:t>31</w:t>
+      </w:r>
+      <w:r>
+        <w:rPr>
+          <w:rFonts w:ascii="Times New Roman" w:eastAsia="Times New Roman" w:hAnsi="Times New Roman" w:cs="Times New Roman"/>
+          <w:sz w:val="24"/>
+          <w:szCs w:val="24"/>
+        </w:rPr>
+        <w:t>(3), 1–11. https://doi.org/10.1111/jvs.12867</w:t>
       </w:r>
     </w:p>
     <w:p>
@@ -7397,26 +7605,17 @@
           <w:rFonts w:ascii="Times New Roman" w:eastAsia="Times New Roman" w:hAnsi="Times New Roman" w:cs="Times New Roman"/>
           <w:sz w:val="24"/>
           <w:szCs w:val="24"/>
-          <w:lang w:val="de-DE"/>
-        </w:rPr>
-        <w:t xml:space="preserve">Meyer, C., Kreft, H., Guralnick, R., &amp; Jetz, W. (2015). </w:t>
-      </w:r>
-      <w:r>
-        <w:rPr>
-          <w:rFonts w:ascii="Times New Roman" w:eastAsia="Times New Roman" w:hAnsi="Times New Roman" w:cs="Times New Roman"/>
-          <w:sz w:val="24"/>
-          <w:szCs w:val="24"/>
-        </w:rPr>
-        <w:t xml:space="preserve">Global priorities for an effective information basis of biodiversity distributions. </w:t>
-      </w:r>
-      <w:r>
-        <w:rPr>
-          <w:rFonts w:ascii="Times New Roman" w:eastAsia="Times New Roman" w:hAnsi="Times New Roman" w:cs="Times New Roman"/>
-          <w:i/>
-          <w:sz w:val="24"/>
-          <w:szCs w:val="24"/>
-        </w:rPr>
-        <w:t>Nature Communications</w:t>
+        </w:rPr>
+        <w:t xml:space="preserve">Mendieta-Leiva, G., &amp; Zotz, G. (2015). A conceptual framework for the analysis of vascular epiphyte assemblages. </w:t>
+      </w:r>
+      <w:r>
+        <w:rPr>
+          <w:rFonts w:ascii="Times New Roman" w:eastAsia="Times New Roman" w:hAnsi="Times New Roman" w:cs="Times New Roman"/>
+          <w:i/>
+          <w:sz w:val="24"/>
+          <w:szCs w:val="24"/>
+        </w:rPr>
+        <w:t>Perspectives in Plant Ecology, Evolution and Systematics</w:t>
       </w:r>
       <w:r>
         <w:rPr>
@@ -7433,15 +7632,15 @@
           <w:sz w:val="24"/>
           <w:szCs w:val="24"/>
         </w:rPr>
-        <w:t>6</w:t>
-      </w:r>
-      <w:r>
-        <w:rPr>
-          <w:rFonts w:ascii="Times New Roman" w:eastAsia="Times New Roman" w:hAnsi="Times New Roman" w:cs="Times New Roman"/>
-          <w:sz w:val="24"/>
-          <w:szCs w:val="24"/>
-        </w:rPr>
-        <w:t>(1), 8221. https://doi.org/10.1038/ncomms9221</w:t>
+        <w:t>17</w:t>
+      </w:r>
+      <w:r>
+        <w:rPr>
+          <w:rFonts w:ascii="Times New Roman" w:eastAsia="Times New Roman" w:hAnsi="Times New Roman" w:cs="Times New Roman"/>
+          <w:sz w:val="24"/>
+          <w:szCs w:val="24"/>
+        </w:rPr>
+        <w:t>(6), 510–521. https://doi.org/10.1016/j.ppees.2015.09.003</w:t>
       </w:r>
     </w:p>
     <w:p>
@@ -7459,33 +7658,39 @@
           <w:rFonts w:ascii="Times New Roman" w:eastAsia="Times New Roman" w:hAnsi="Times New Roman" w:cs="Times New Roman"/>
           <w:sz w:val="24"/>
           <w:szCs w:val="24"/>
-          <w:lang w:val="es-ES"/>
-        </w:rPr>
-      </w:pPr>
-      <w:r>
-        <w:rPr>
-          <w:rFonts w:ascii="Times New Roman" w:eastAsia="Times New Roman" w:hAnsi="Times New Roman" w:cs="Times New Roman"/>
-          <w:sz w:val="24"/>
-          <w:szCs w:val="24"/>
-        </w:rPr>
-        <w:t xml:space="preserve">Meyer, C., Weigelt, P., &amp; Kreft, H. (2016). Multidimensional biases, gaps and uncertainties in global plant occurrence information. </w:t>
-      </w:r>
-      <w:r>
-        <w:rPr>
-          <w:rFonts w:ascii="Times New Roman" w:eastAsia="Times New Roman" w:hAnsi="Times New Roman" w:cs="Times New Roman"/>
-          <w:i/>
-          <w:sz w:val="24"/>
-          <w:szCs w:val="24"/>
-          <w:lang w:val="es-ES"/>
-        </w:rPr>
-        <w:t>Ecology Letters</w:t>
-      </w:r>
-      <w:r>
-        <w:rPr>
-          <w:rFonts w:ascii="Times New Roman" w:eastAsia="Times New Roman" w:hAnsi="Times New Roman" w:cs="Times New Roman"/>
-          <w:sz w:val="24"/>
-          <w:szCs w:val="24"/>
-          <w:lang w:val="es-ES"/>
+        </w:rPr>
+      </w:pPr>
+      <w:r>
+        <w:rPr>
+          <w:rFonts w:ascii="Times New Roman" w:eastAsia="Times New Roman" w:hAnsi="Times New Roman" w:cs="Times New Roman"/>
+          <w:sz w:val="24"/>
+          <w:szCs w:val="24"/>
+          <w:lang w:val="de-DE"/>
+        </w:rPr>
+        <w:t xml:space="preserve">Meyer, C., Kreft, H., Guralnick, R., &amp; Jetz, W. (2015). </w:t>
+      </w:r>
+      <w:r>
+        <w:rPr>
+          <w:rFonts w:ascii="Times New Roman" w:eastAsia="Times New Roman" w:hAnsi="Times New Roman" w:cs="Times New Roman"/>
+          <w:sz w:val="24"/>
+          <w:szCs w:val="24"/>
+        </w:rPr>
+        <w:t xml:space="preserve">Global priorities for an effective information basis of biodiversity distributions. </w:t>
+      </w:r>
+      <w:r>
+        <w:rPr>
+          <w:rFonts w:ascii="Times New Roman" w:eastAsia="Times New Roman" w:hAnsi="Times New Roman" w:cs="Times New Roman"/>
+          <w:i/>
+          <w:sz w:val="24"/>
+          <w:szCs w:val="24"/>
+        </w:rPr>
+        <w:t>Nature Communications</w:t>
+      </w:r>
+      <w:r>
+        <w:rPr>
+          <w:rFonts w:ascii="Times New Roman" w:eastAsia="Times New Roman" w:hAnsi="Times New Roman" w:cs="Times New Roman"/>
+          <w:sz w:val="24"/>
+          <w:szCs w:val="24"/>
         </w:rPr>
         <w:t xml:space="preserve">, </w:t>
       </w:r>
@@ -7495,18 +7700,16 @@
           <w:i/>
           <w:sz w:val="24"/>
           <w:szCs w:val="24"/>
-          <w:lang w:val="es-ES"/>
-        </w:rPr>
-        <w:t>19</w:t>
-      </w:r>
-      <w:r>
-        <w:rPr>
-          <w:rFonts w:ascii="Times New Roman" w:eastAsia="Times New Roman" w:hAnsi="Times New Roman" w:cs="Times New Roman"/>
-          <w:sz w:val="24"/>
-          <w:szCs w:val="24"/>
-          <w:lang w:val="es-ES"/>
-        </w:rPr>
-        <w:t>(8), 992–1006. https://doi.org/10.1111/ele.12624</w:t>
+        </w:rPr>
+        <w:t>6</w:t>
+      </w:r>
+      <w:r>
+        <w:rPr>
+          <w:rFonts w:ascii="Times New Roman" w:eastAsia="Times New Roman" w:hAnsi="Times New Roman" w:cs="Times New Roman"/>
+          <w:sz w:val="24"/>
+          <w:szCs w:val="24"/>
+        </w:rPr>
+        <w:t>(1), 8221. https://doi.org/10.1038/ncomms9221</w:t>
       </w:r>
     </w:p>
     <w:p>
@@ -7532,55 +7735,46 @@
           <w:rFonts w:ascii="Times New Roman" w:eastAsia="Times New Roman" w:hAnsi="Times New Roman" w:cs="Times New Roman"/>
           <w:sz w:val="24"/>
           <w:szCs w:val="24"/>
+        </w:rPr>
+        <w:t xml:space="preserve">Meyer, C., Weigelt, P., &amp; Kreft, H. (2016). Multidimensional biases, gaps and uncertainties in global plant occurrence information. </w:t>
+      </w:r>
+      <w:r>
+        <w:rPr>
+          <w:rFonts w:ascii="Times New Roman" w:eastAsia="Times New Roman" w:hAnsi="Times New Roman" w:cs="Times New Roman"/>
+          <w:i/>
+          <w:sz w:val="24"/>
+          <w:szCs w:val="24"/>
           <w:lang w:val="es-ES"/>
         </w:rPr>
-        <w:t xml:space="preserve">Morrone, J. J., Escalante, T., Rodríguez-Tapia, G., Carmona, A., Arana, M., &amp; Mercado-Gómez, J. D. (2022). </w:t>
-      </w:r>
-      <w:r>
-        <w:rPr>
-          <w:rFonts w:ascii="Times New Roman" w:eastAsia="Times New Roman" w:hAnsi="Times New Roman" w:cs="Times New Roman"/>
-          <w:sz w:val="24"/>
-          <w:szCs w:val="24"/>
-        </w:rPr>
-        <w:t xml:space="preserve">Biogeographic regionalization of the Neotropical region: New map and shapefile. </w:t>
-      </w:r>
-      <w:r>
-        <w:rPr>
-          <w:rFonts w:ascii="Times New Roman" w:eastAsia="Times New Roman" w:hAnsi="Times New Roman" w:cs="Times New Roman"/>
-          <w:i/>
+        <w:t>Ecology Letters</w:t>
+      </w:r>
+      <w:r>
+        <w:rPr>
+          <w:rFonts w:ascii="Times New Roman" w:eastAsia="Times New Roman" w:hAnsi="Times New Roman" w:cs="Times New Roman"/>
           <w:sz w:val="24"/>
           <w:szCs w:val="24"/>
           <w:lang w:val="es-ES"/>
         </w:rPr>
-        <w:t>Anais Da Academia Brasileira de Ciências</w:t>
-      </w:r>
-      <w:r>
-        <w:rPr>
-          <w:rFonts w:ascii="Times New Roman" w:eastAsia="Times New Roman" w:hAnsi="Times New Roman" w:cs="Times New Roman"/>
+        <w:t xml:space="preserve">, </w:t>
+      </w:r>
+      <w:r>
+        <w:rPr>
+          <w:rFonts w:ascii="Times New Roman" w:eastAsia="Times New Roman" w:hAnsi="Times New Roman" w:cs="Times New Roman"/>
+          <w:i/>
           <w:sz w:val="24"/>
           <w:szCs w:val="24"/>
           <w:lang w:val="es-ES"/>
         </w:rPr>
-        <w:t xml:space="preserve">, </w:t>
-      </w:r>
-      <w:r>
-        <w:rPr>
-          <w:rFonts w:ascii="Times New Roman" w:eastAsia="Times New Roman" w:hAnsi="Times New Roman" w:cs="Times New Roman"/>
-          <w:i/>
+        <w:t>19</w:t>
+      </w:r>
+      <w:r>
+        <w:rPr>
+          <w:rFonts w:ascii="Times New Roman" w:eastAsia="Times New Roman" w:hAnsi="Times New Roman" w:cs="Times New Roman"/>
           <w:sz w:val="24"/>
           <w:szCs w:val="24"/>
           <w:lang w:val="es-ES"/>
         </w:rPr>
-        <w:t>94</w:t>
-      </w:r>
-      <w:r>
-        <w:rPr>
-          <w:rFonts w:ascii="Times New Roman" w:eastAsia="Times New Roman" w:hAnsi="Times New Roman" w:cs="Times New Roman"/>
-          <w:sz w:val="24"/>
-          <w:szCs w:val="24"/>
-          <w:lang w:val="es-ES"/>
-        </w:rPr>
-        <w:t>(1), e20211167. https://doi.org/10.1590/0001-3765202220211167</w:t>
+        <w:t>(8), 992–1006. https://doi.org/10.1111/ele.12624</w:t>
       </w:r>
     </w:p>
     <w:p>
@@ -7598,31 +7792,42 @@
           <w:rFonts w:ascii="Times New Roman" w:eastAsia="Times New Roman" w:hAnsi="Times New Roman" w:cs="Times New Roman"/>
           <w:sz w:val="24"/>
           <w:szCs w:val="24"/>
-        </w:rPr>
-      </w:pPr>
-      <w:r>
-        <w:rPr>
-          <w:rFonts w:ascii="Times New Roman" w:eastAsia="Times New Roman" w:hAnsi="Times New Roman" w:cs="Times New Roman"/>
-          <w:sz w:val="24"/>
-          <w:szCs w:val="24"/>
-        </w:rPr>
-        <w:lastRenderedPageBreak/>
-        <w:t xml:space="preserve">Nicolson, N., Trekels, M., Groom, Q. J., Knapp, S., &amp; Paton, A. J. (2023). Global access to nomenclatural botanical resources: Evaluating open access availability. </w:t>
-      </w:r>
-      <w:r>
-        <w:rPr>
-          <w:rFonts w:ascii="Times New Roman" w:eastAsia="Times New Roman" w:hAnsi="Times New Roman" w:cs="Times New Roman"/>
-          <w:i/>
-          <w:sz w:val="24"/>
-          <w:szCs w:val="24"/>
-        </w:rPr>
-        <w:t>PLANTS, PEOPLE, PLANET</w:t>
-      </w:r>
-      <w:r>
-        <w:rPr>
-          <w:rFonts w:ascii="Times New Roman" w:eastAsia="Times New Roman" w:hAnsi="Times New Roman" w:cs="Times New Roman"/>
-          <w:sz w:val="24"/>
-          <w:szCs w:val="24"/>
+          <w:lang w:val="es-ES"/>
+        </w:rPr>
+      </w:pPr>
+      <w:r>
+        <w:rPr>
+          <w:rFonts w:ascii="Times New Roman" w:eastAsia="Times New Roman" w:hAnsi="Times New Roman" w:cs="Times New Roman"/>
+          <w:sz w:val="24"/>
+          <w:szCs w:val="24"/>
+          <w:lang w:val="es-ES"/>
+        </w:rPr>
+        <w:t xml:space="preserve">Morrone, J. J., Escalante, T., Rodríguez-Tapia, G., Carmona, A., Arana, M., &amp; Mercado-Gómez, J. D. (2022). </w:t>
+      </w:r>
+      <w:r>
+        <w:rPr>
+          <w:rFonts w:ascii="Times New Roman" w:eastAsia="Times New Roman" w:hAnsi="Times New Roman" w:cs="Times New Roman"/>
+          <w:sz w:val="24"/>
+          <w:szCs w:val="24"/>
+        </w:rPr>
+        <w:t xml:space="preserve">Biogeographic regionalization of the Neotropical region: New map and shapefile. </w:t>
+      </w:r>
+      <w:r>
+        <w:rPr>
+          <w:rFonts w:ascii="Times New Roman" w:eastAsia="Times New Roman" w:hAnsi="Times New Roman" w:cs="Times New Roman"/>
+          <w:i/>
+          <w:sz w:val="24"/>
+          <w:szCs w:val="24"/>
+          <w:lang w:val="es-ES"/>
+        </w:rPr>
+        <w:t>Anais Da Academia Brasileira de Ciências</w:t>
+      </w:r>
+      <w:r>
+        <w:rPr>
+          <w:rFonts w:ascii="Times New Roman" w:eastAsia="Times New Roman" w:hAnsi="Times New Roman" w:cs="Times New Roman"/>
+          <w:sz w:val="24"/>
+          <w:szCs w:val="24"/>
+          <w:lang w:val="es-ES"/>
         </w:rPr>
         <w:t xml:space="preserve">, </w:t>
       </w:r>
@@ -7632,16 +7837,18 @@
           <w:i/>
           <w:sz w:val="24"/>
           <w:szCs w:val="24"/>
-        </w:rPr>
-        <w:t>5</w:t>
-      </w:r>
-      <w:r>
-        <w:rPr>
-          <w:rFonts w:ascii="Times New Roman" w:eastAsia="Times New Roman" w:hAnsi="Times New Roman" w:cs="Times New Roman"/>
-          <w:sz w:val="24"/>
-          <w:szCs w:val="24"/>
-        </w:rPr>
-        <w:t>(6), 899–907. https://doi.org/10.1002/ppp3.10438</w:t>
+          <w:lang w:val="es-ES"/>
+        </w:rPr>
+        <w:t>94</w:t>
+      </w:r>
+      <w:r>
+        <w:rPr>
+          <w:rFonts w:ascii="Times New Roman" w:eastAsia="Times New Roman" w:hAnsi="Times New Roman" w:cs="Times New Roman"/>
+          <w:sz w:val="24"/>
+          <w:szCs w:val="24"/>
+          <w:lang w:val="es-ES"/>
+        </w:rPr>
+        <w:t>(1), e20211167. https://doi.org/10.1590/0001-3765202220211167</w:t>
       </w:r>
     </w:p>
     <w:p>
@@ -7667,16 +7874,17 @@
           <w:sz w:val="24"/>
           <w:szCs w:val="24"/>
         </w:rPr>
-        <w:t xml:space="preserve">Nieder, J., Prosperi, J., &amp; Michaloud, G. (2001). Epiphytes and their contribution to canopy diversity. </w:t>
-      </w:r>
-      <w:r>
-        <w:rPr>
-          <w:rFonts w:ascii="Times New Roman" w:eastAsia="Times New Roman" w:hAnsi="Times New Roman" w:cs="Times New Roman"/>
-          <w:i/>
-          <w:sz w:val="24"/>
-          <w:szCs w:val="24"/>
-        </w:rPr>
-        <w:t>Plant Ecology</w:t>
+        <w:lastRenderedPageBreak/>
+        <w:t xml:space="preserve">Nicolson, N., Trekels, M., Groom, Q. J., Knapp, S., &amp; Paton, A. J. (2023). Global access to nomenclatural botanical resources: Evaluating open access availability. </w:t>
+      </w:r>
+      <w:r>
+        <w:rPr>
+          <w:rFonts w:ascii="Times New Roman" w:eastAsia="Times New Roman" w:hAnsi="Times New Roman" w:cs="Times New Roman"/>
+          <w:i/>
+          <w:sz w:val="24"/>
+          <w:szCs w:val="24"/>
+        </w:rPr>
+        <w:t>PLANTS, PEOPLE, PLANET</w:t>
       </w:r>
       <w:r>
         <w:rPr>
@@ -7693,15 +7901,15 @@
           <w:sz w:val="24"/>
           <w:szCs w:val="24"/>
         </w:rPr>
-        <w:t>153</w:t>
-      </w:r>
-      <w:r>
-        <w:rPr>
-          <w:rFonts w:ascii="Times New Roman" w:eastAsia="Times New Roman" w:hAnsi="Times New Roman" w:cs="Times New Roman"/>
-          <w:sz w:val="24"/>
-          <w:szCs w:val="24"/>
-        </w:rPr>
-        <w:t>, 51–63.</w:t>
+        <w:t>5</w:t>
+      </w:r>
+      <w:r>
+        <w:rPr>
+          <w:rFonts w:ascii="Times New Roman" w:eastAsia="Times New Roman" w:hAnsi="Times New Roman" w:cs="Times New Roman"/>
+          <w:sz w:val="24"/>
+          <w:szCs w:val="24"/>
+        </w:rPr>
+        <w:t>(6), 899–907. https://doi.org/10.1002/ppp3.10438</w:t>
       </w:r>
     </w:p>
     <w:p>
@@ -7727,33 +7935,16 @@
           <w:sz w:val="24"/>
           <w:szCs w:val="24"/>
         </w:rPr>
-        <w:t xml:space="preserve">Oliveira, U., Paglia, A. P., Brescovit, A. D., De Carvalho, C. J. B., Silva, D. P., Rezende, D. T., Leite, F. S. F., Batista, J. A. N., Barbosa, J. P. P. P., Stehmann, J. R., Ascher, J. S., De Vasconcelos, M. F., De Marco, P., Löwenberg‐Neto, P., Dias, P. G., Ferro, V. G., &amp; Santos, A. J. (2016). The strong influence of collection bias on biodiversity knowledge shortfalls of </w:t>
-      </w:r>
-      <w:r>
-        <w:rPr>
-          <w:rFonts w:ascii="Times New Roman" w:eastAsia="Times New Roman" w:hAnsi="Times New Roman" w:cs="Times New Roman"/>
-          <w:smallCaps/>
-          <w:sz w:val="24"/>
-          <w:szCs w:val="24"/>
-        </w:rPr>
-        <w:t>B</w:t>
-      </w:r>
-      <w:r>
-        <w:rPr>
-          <w:rFonts w:ascii="Times New Roman" w:eastAsia="Times New Roman" w:hAnsi="Times New Roman" w:cs="Times New Roman"/>
-          <w:sz w:val="24"/>
-          <w:szCs w:val="24"/>
-        </w:rPr>
-        <w:t xml:space="preserve"> razilian terrestrial biodiversity. </w:t>
-      </w:r>
-      <w:r>
-        <w:rPr>
-          <w:rFonts w:ascii="Times New Roman" w:eastAsia="Times New Roman" w:hAnsi="Times New Roman" w:cs="Times New Roman"/>
-          <w:i/>
-          <w:sz w:val="24"/>
-          <w:szCs w:val="24"/>
-        </w:rPr>
-        <w:t>Diversity and Distributions</w:t>
+        <w:t xml:space="preserve">Nieder, J., Prosperi, J., &amp; Michaloud, G. (2001). Epiphytes and their contribution to canopy diversity. </w:t>
+      </w:r>
+      <w:r>
+        <w:rPr>
+          <w:rFonts w:ascii="Times New Roman" w:eastAsia="Times New Roman" w:hAnsi="Times New Roman" w:cs="Times New Roman"/>
+          <w:i/>
+          <w:sz w:val="24"/>
+          <w:szCs w:val="24"/>
+        </w:rPr>
+        <w:t>Plant Ecology</w:t>
       </w:r>
       <w:r>
         <w:rPr>
@@ -7770,15 +7961,15 @@
           <w:sz w:val="24"/>
           <w:szCs w:val="24"/>
         </w:rPr>
-        <w:t>22</w:t>
-      </w:r>
-      <w:r>
-        <w:rPr>
-          <w:rFonts w:ascii="Times New Roman" w:eastAsia="Times New Roman" w:hAnsi="Times New Roman" w:cs="Times New Roman"/>
-          <w:sz w:val="24"/>
-          <w:szCs w:val="24"/>
-        </w:rPr>
-        <w:t>(12), 1232–1244. https://doi.org/10.1111/ddi.12489</w:t>
+        <w:t>153</w:t>
+      </w:r>
+      <w:r>
+        <w:rPr>
+          <w:rFonts w:ascii="Times New Roman" w:eastAsia="Times New Roman" w:hAnsi="Times New Roman" w:cs="Times New Roman"/>
+          <w:sz w:val="24"/>
+          <w:szCs w:val="24"/>
+        </w:rPr>
+        <w:t>, 51–63.</w:t>
       </w:r>
     </w:p>
     <w:p>
@@ -7804,16 +7995,33 @@
           <w:sz w:val="24"/>
           <w:szCs w:val="24"/>
         </w:rPr>
-        <w:t xml:space="preserve">Ondo, I., Dhanjal‐Adams, K. L., Pironon, S., Silvestro, D., Colli‐Silva, M., Deklerck, V., Grace, O. M., Monro, A. K., Nicolson, N., Walker, B., &amp; Antonelli, A. (2024). Plant diversity darkspots for global collection priorities. </w:t>
-      </w:r>
-      <w:r>
-        <w:rPr>
-          <w:rFonts w:ascii="Times New Roman" w:eastAsia="Times New Roman" w:hAnsi="Times New Roman" w:cs="Times New Roman"/>
-          <w:i/>
-          <w:sz w:val="24"/>
-          <w:szCs w:val="24"/>
-        </w:rPr>
-        <w:t>New Phytologist</w:t>
+        <w:t xml:space="preserve">Oliveira, U., Paglia, A. P., Brescovit, A. D., De Carvalho, C. J. B., Silva, D. P., Rezende, D. T., Leite, F. S. F., Batista, J. A. N., Barbosa, J. P. P. P., Stehmann, J. R., Ascher, J. S., De Vasconcelos, M. F., De Marco, P., Löwenberg‐Neto, P., Dias, P. G., Ferro, V. G., &amp; Santos, A. J. (2016). The strong influence of collection bias on biodiversity knowledge shortfalls of </w:t>
+      </w:r>
+      <w:r>
+        <w:rPr>
+          <w:rFonts w:ascii="Times New Roman" w:eastAsia="Times New Roman" w:hAnsi="Times New Roman" w:cs="Times New Roman"/>
+          <w:smallCaps/>
+          <w:sz w:val="24"/>
+          <w:szCs w:val="24"/>
+        </w:rPr>
+        <w:t>B</w:t>
+      </w:r>
+      <w:r>
+        <w:rPr>
+          <w:rFonts w:ascii="Times New Roman" w:eastAsia="Times New Roman" w:hAnsi="Times New Roman" w:cs="Times New Roman"/>
+          <w:sz w:val="24"/>
+          <w:szCs w:val="24"/>
+        </w:rPr>
+        <w:t xml:space="preserve"> razilian terrestrial biodiversity. </w:t>
+      </w:r>
+      <w:r>
+        <w:rPr>
+          <w:rFonts w:ascii="Times New Roman" w:eastAsia="Times New Roman" w:hAnsi="Times New Roman" w:cs="Times New Roman"/>
+          <w:i/>
+          <w:sz w:val="24"/>
+          <w:szCs w:val="24"/>
+        </w:rPr>
+        <w:t>Diversity and Distributions</w:t>
       </w:r>
       <w:r>
         <w:rPr>
@@ -7830,15 +8038,15 @@
           <w:sz w:val="24"/>
           <w:szCs w:val="24"/>
         </w:rPr>
-        <w:t>244</w:t>
-      </w:r>
-      <w:r>
-        <w:rPr>
-          <w:rFonts w:ascii="Times New Roman" w:eastAsia="Times New Roman" w:hAnsi="Times New Roman" w:cs="Times New Roman"/>
-          <w:sz w:val="24"/>
-          <w:szCs w:val="24"/>
-        </w:rPr>
-        <w:t>(2), 719–733. https://doi.org/10.1111/nph.20024</w:t>
+        <w:t>22</w:t>
+      </w:r>
+      <w:r>
+        <w:rPr>
+          <w:rFonts w:ascii="Times New Roman" w:eastAsia="Times New Roman" w:hAnsi="Times New Roman" w:cs="Times New Roman"/>
+          <w:sz w:val="24"/>
+          <w:szCs w:val="24"/>
+        </w:rPr>
+        <w:t>(12), 1232–1244. https://doi.org/10.1111/ddi.12489</w:t>
       </w:r>
     </w:p>
     <w:p>
@@ -7864,16 +8072,16 @@
           <w:sz w:val="24"/>
           <w:szCs w:val="24"/>
         </w:rPr>
-        <w:t xml:space="preserve">Pebesma, E. (2018). Simple Features for R: Standardized Support for Spatial Vector Data. </w:t>
-      </w:r>
-      <w:r>
-        <w:rPr>
-          <w:rFonts w:ascii="Times New Roman" w:eastAsia="Times New Roman" w:hAnsi="Times New Roman" w:cs="Times New Roman"/>
-          <w:i/>
-          <w:sz w:val="24"/>
-          <w:szCs w:val="24"/>
-        </w:rPr>
-        <w:t>The R Journal</w:t>
+        <w:t xml:space="preserve">Ondo, I., Dhanjal‐Adams, K. L., Pironon, S., Silvestro, D., Colli‐Silva, M., Deklerck, V., Grace, O. M., Monro, A. K., Nicolson, N., Walker, B., &amp; Antonelli, A. (2024). Plant diversity darkspots for global collection priorities. </w:t>
+      </w:r>
+      <w:r>
+        <w:rPr>
+          <w:rFonts w:ascii="Times New Roman" w:eastAsia="Times New Roman" w:hAnsi="Times New Roman" w:cs="Times New Roman"/>
+          <w:i/>
+          <w:sz w:val="24"/>
+          <w:szCs w:val="24"/>
+        </w:rPr>
+        <w:t>New Phytologist</w:t>
       </w:r>
       <w:r>
         <w:rPr>
@@ -7890,15 +8098,15 @@
           <w:sz w:val="24"/>
           <w:szCs w:val="24"/>
         </w:rPr>
-        <w:t>10</w:t>
-      </w:r>
-      <w:r>
-        <w:rPr>
-          <w:rFonts w:ascii="Times New Roman" w:eastAsia="Times New Roman" w:hAnsi="Times New Roman" w:cs="Times New Roman"/>
-          <w:sz w:val="24"/>
-          <w:szCs w:val="24"/>
-        </w:rPr>
-        <w:t>(1), 439. https://doi.org/10.32614/RJ-2018-009</w:t>
+        <w:t>244</w:t>
+      </w:r>
+      <w:r>
+        <w:rPr>
+          <w:rFonts w:ascii="Times New Roman" w:eastAsia="Times New Roman" w:hAnsi="Times New Roman" w:cs="Times New Roman"/>
+          <w:sz w:val="24"/>
+          <w:szCs w:val="24"/>
+        </w:rPr>
+        <w:t>(2), 719–733. https://doi.org/10.1111/nph.20024</w:t>
       </w:r>
     </w:p>
     <w:p>
@@ -7924,26 +8132,16 @@
           <w:sz w:val="24"/>
           <w:szCs w:val="24"/>
         </w:rPr>
-        <w:t xml:space="preserve">Perez, T. M., Valverde-Barrantes, O., Bravo, C., Taylor, T. C., Fadrique, B., Hogan, J. A., Pardo, C. J., Stroud, J. T., Baraloto, C., &amp; Feeley, K. J. (2019). Botanic gardens are an untapped resource for studying the functional ecology of tropical plants. </w:t>
-      </w:r>
-      <w:r>
-        <w:rPr>
-          <w:rFonts w:ascii="Times New Roman" w:eastAsia="Times New Roman" w:hAnsi="Times New Roman" w:cs="Times New Roman"/>
-          <w:i/>
-          <w:sz w:val="24"/>
-          <w:szCs w:val="24"/>
-        </w:rPr>
-        <w:t xml:space="preserve">Philosophical Transactions </w:t>
-      </w:r>
-      <w:r>
-        <w:rPr>
-          <w:rFonts w:ascii="Times New Roman" w:eastAsia="Times New Roman" w:hAnsi="Times New Roman" w:cs="Times New Roman"/>
-          <w:i/>
-          <w:sz w:val="24"/>
-          <w:szCs w:val="24"/>
-        </w:rPr>
-        <w:lastRenderedPageBreak/>
-        <w:t>of the Royal Society B: Biological Sciences</w:t>
+        <w:t xml:space="preserve">Pebesma, E. (2018). Simple Features for R: Standardized Support for Spatial Vector Data. </w:t>
+      </w:r>
+      <w:r>
+        <w:rPr>
+          <w:rFonts w:ascii="Times New Roman" w:eastAsia="Times New Roman" w:hAnsi="Times New Roman" w:cs="Times New Roman"/>
+          <w:i/>
+          <w:sz w:val="24"/>
+          <w:szCs w:val="24"/>
+        </w:rPr>
+        <w:t>The R Journal</w:t>
       </w:r>
       <w:r>
         <w:rPr>
@@ -7960,15 +8158,15 @@
           <w:sz w:val="24"/>
           <w:szCs w:val="24"/>
         </w:rPr>
-        <w:t>374</w:t>
-      </w:r>
-      <w:r>
-        <w:rPr>
-          <w:rFonts w:ascii="Times New Roman" w:eastAsia="Times New Roman" w:hAnsi="Times New Roman" w:cs="Times New Roman"/>
-          <w:sz w:val="24"/>
-          <w:szCs w:val="24"/>
-        </w:rPr>
-        <w:t>(1763), 20170390. https://doi.org/10.1098/rstb.2017.0390</w:t>
+        <w:t>10</w:t>
+      </w:r>
+      <w:r>
+        <w:rPr>
+          <w:rFonts w:ascii="Times New Roman" w:eastAsia="Times New Roman" w:hAnsi="Times New Roman" w:cs="Times New Roman"/>
+          <w:sz w:val="24"/>
+          <w:szCs w:val="24"/>
+        </w:rPr>
+        <w:t>(1), 439. https://doi.org/10.32614/RJ-2018-009</w:t>
       </w:r>
     </w:p>
     <w:p>
@@ -7994,16 +8192,26 @@
           <w:sz w:val="24"/>
           <w:szCs w:val="24"/>
         </w:rPr>
-        <w:t xml:space="preserve">Prance, G. T., Beentje, H., Dransfield, J., &amp; Johns, R. (2000). The Tropical Flora Remains Undercollected. </w:t>
-      </w:r>
-      <w:r>
-        <w:rPr>
-          <w:rFonts w:ascii="Times New Roman" w:eastAsia="Times New Roman" w:hAnsi="Times New Roman" w:cs="Times New Roman"/>
-          <w:i/>
-          <w:sz w:val="24"/>
-          <w:szCs w:val="24"/>
-        </w:rPr>
-        <w:t>Annals of the Missouri Botanical Garden</w:t>
+        <w:t xml:space="preserve">Perez, T. M., Valverde-Barrantes, O., Bravo, C., Taylor, T. C., Fadrique, B., Hogan, J. A., Pardo, C. J., Stroud, J. T., Baraloto, C., &amp; Feeley, K. J. (2019). Botanic gardens are an untapped resource for studying the functional ecology of tropical plants. </w:t>
+      </w:r>
+      <w:r>
+        <w:rPr>
+          <w:rFonts w:ascii="Times New Roman" w:eastAsia="Times New Roman" w:hAnsi="Times New Roman" w:cs="Times New Roman"/>
+          <w:i/>
+          <w:sz w:val="24"/>
+          <w:szCs w:val="24"/>
+        </w:rPr>
+        <w:t xml:space="preserve">Philosophical Transactions </w:t>
+      </w:r>
+      <w:r>
+        <w:rPr>
+          <w:rFonts w:ascii="Times New Roman" w:eastAsia="Times New Roman" w:hAnsi="Times New Roman" w:cs="Times New Roman"/>
+          <w:i/>
+          <w:sz w:val="24"/>
+          <w:szCs w:val="24"/>
+        </w:rPr>
+        <w:lastRenderedPageBreak/>
+        <w:t>of the Royal Society B: Biological Sciences</w:t>
       </w:r>
       <w:r>
         <w:rPr>
@@ -8020,15 +8228,15 @@
           <w:sz w:val="24"/>
           <w:szCs w:val="24"/>
         </w:rPr>
-        <w:t>87</w:t>
-      </w:r>
-      <w:r>
-        <w:rPr>
-          <w:rFonts w:ascii="Times New Roman" w:eastAsia="Times New Roman" w:hAnsi="Times New Roman" w:cs="Times New Roman"/>
-          <w:sz w:val="24"/>
-          <w:szCs w:val="24"/>
-        </w:rPr>
-        <w:t>(1), 67. https://doi.org/10.2307/2666209</w:t>
+        <w:t>374</w:t>
+      </w:r>
+      <w:r>
+        <w:rPr>
+          <w:rFonts w:ascii="Times New Roman" w:eastAsia="Times New Roman" w:hAnsi="Times New Roman" w:cs="Times New Roman"/>
+          <w:sz w:val="24"/>
+          <w:szCs w:val="24"/>
+        </w:rPr>
+        <w:t>(1763), 20170390. https://doi.org/10.1098/rstb.2017.0390</w:t>
       </w:r>
     </w:p>
     <w:p>
@@ -8054,16 +8262,16 @@
           <w:sz w:val="24"/>
           <w:szCs w:val="24"/>
         </w:rPr>
-        <w:t xml:space="preserve">Quaresma, A., Zartman, C. E., Piedade, M. T. F., Wittmann, F., Jardim, M. A. G., Irume, M. V., Benavides, A. M., Freitas, L., Toledo, J. J., Boelter, C. R., Obermüller, F., Duque, A. J., Klein, V. P., Mari, M. L. G., Schöngart, J., Arenas, E., Pos, E. T., Vasco, A., Ek, R., … Ter Steege, H. (2022). The Amazon Epiphyte Network: A First Glimpse Into Continental-Scale Patterns of Amazonian Vascular Epiphyte Assemblages. </w:t>
-      </w:r>
-      <w:r>
-        <w:rPr>
-          <w:rFonts w:ascii="Times New Roman" w:eastAsia="Times New Roman" w:hAnsi="Times New Roman" w:cs="Times New Roman"/>
-          <w:i/>
-          <w:sz w:val="24"/>
-          <w:szCs w:val="24"/>
-        </w:rPr>
-        <w:t>Frontiers in Forests and Global Change</w:t>
+        <w:t xml:space="preserve">Prance, G. T., Beentje, H., Dransfield, J., &amp; Johns, R. (2000). The Tropical Flora Remains Undercollected. </w:t>
+      </w:r>
+      <w:r>
+        <w:rPr>
+          <w:rFonts w:ascii="Times New Roman" w:eastAsia="Times New Roman" w:hAnsi="Times New Roman" w:cs="Times New Roman"/>
+          <w:i/>
+          <w:sz w:val="24"/>
+          <w:szCs w:val="24"/>
+        </w:rPr>
+        <w:t>Annals of the Missouri Botanical Garden</w:t>
       </w:r>
       <w:r>
         <w:rPr>
@@ -8080,15 +8288,15 @@
           <w:sz w:val="24"/>
           <w:szCs w:val="24"/>
         </w:rPr>
-        <w:t>5</w:t>
-      </w:r>
-      <w:r>
-        <w:rPr>
-          <w:rFonts w:ascii="Times New Roman" w:eastAsia="Times New Roman" w:hAnsi="Times New Roman" w:cs="Times New Roman"/>
-          <w:sz w:val="24"/>
-          <w:szCs w:val="24"/>
-        </w:rPr>
-        <w:t>, 828759. https://doi.org/10.3389/ffgc.2022.828759</w:t>
+        <w:t>87</w:t>
+      </w:r>
+      <w:r>
+        <w:rPr>
+          <w:rFonts w:ascii="Times New Roman" w:eastAsia="Times New Roman" w:hAnsi="Times New Roman" w:cs="Times New Roman"/>
+          <w:sz w:val="24"/>
+          <w:szCs w:val="24"/>
+        </w:rPr>
+        <w:t>(1), 67. https://doi.org/10.2307/2666209</w:t>
       </w:r>
     </w:p>
     <w:p>
@@ -8114,24 +8322,41 @@
           <w:sz w:val="24"/>
           <w:szCs w:val="24"/>
         </w:rPr>
-        <w:t xml:space="preserve">R. Core Team. (2024). </w:t>
-      </w:r>
-      <w:r>
-        <w:rPr>
-          <w:rFonts w:ascii="Times New Roman" w:eastAsia="Times New Roman" w:hAnsi="Times New Roman" w:cs="Times New Roman"/>
-          <w:i/>
-          <w:sz w:val="24"/>
-          <w:szCs w:val="24"/>
-        </w:rPr>
-        <w:t>_R: A Language and Environment for Statistical Computing_</w:t>
-      </w:r>
-      <w:r>
-        <w:rPr>
-          <w:rFonts w:ascii="Times New Roman" w:eastAsia="Times New Roman" w:hAnsi="Times New Roman" w:cs="Times New Roman"/>
-          <w:sz w:val="24"/>
-          <w:szCs w:val="24"/>
-        </w:rPr>
-        <w:t xml:space="preserve"> [Computer software]. R Foundation for Statistical Computing. &lt;https://www.R-project.org/&gt;</w:t>
+        <w:t xml:space="preserve">Quaresma, A., Zartman, C. E., Piedade, M. T. F., Wittmann, F., Jardim, M. A. G., Irume, M. V., Benavides, A. M., Freitas, L., Toledo, J. J., Boelter, C. R., Obermüller, F., Duque, A. J., Klein, V. P., Mari, M. L. G., Schöngart, J., Arenas, E., Pos, E. T., Vasco, A., Ek, R., … Ter Steege, H. (2022). The Amazon Epiphyte Network: A First Glimpse Into Continental-Scale Patterns of Amazonian Vascular Epiphyte Assemblages. </w:t>
+      </w:r>
+      <w:r>
+        <w:rPr>
+          <w:rFonts w:ascii="Times New Roman" w:eastAsia="Times New Roman" w:hAnsi="Times New Roman" w:cs="Times New Roman"/>
+          <w:i/>
+          <w:sz w:val="24"/>
+          <w:szCs w:val="24"/>
+        </w:rPr>
+        <w:t>Frontiers in Forests and Global Change</w:t>
+      </w:r>
+      <w:r>
+        <w:rPr>
+          <w:rFonts w:ascii="Times New Roman" w:eastAsia="Times New Roman" w:hAnsi="Times New Roman" w:cs="Times New Roman"/>
+          <w:sz w:val="24"/>
+          <w:szCs w:val="24"/>
+        </w:rPr>
+        <w:t xml:space="preserve">, </w:t>
+      </w:r>
+      <w:r>
+        <w:rPr>
+          <w:rFonts w:ascii="Times New Roman" w:eastAsia="Times New Roman" w:hAnsi="Times New Roman" w:cs="Times New Roman"/>
+          <w:i/>
+          <w:sz w:val="24"/>
+          <w:szCs w:val="24"/>
+        </w:rPr>
+        <w:t>5</w:t>
+      </w:r>
+      <w:r>
+        <w:rPr>
+          <w:rFonts w:ascii="Times New Roman" w:eastAsia="Times New Roman" w:hAnsi="Times New Roman" w:cs="Times New Roman"/>
+          <w:sz w:val="24"/>
+          <w:szCs w:val="24"/>
+        </w:rPr>
+        <w:t>, 828759. https://doi.org/10.3389/ffgc.2022.828759</w:t>
       </w:r>
     </w:p>
     <w:p>
@@ -8149,63 +8374,32 @@
           <w:rFonts w:ascii="Times New Roman" w:eastAsia="Times New Roman" w:hAnsi="Times New Roman" w:cs="Times New Roman"/>
           <w:sz w:val="24"/>
           <w:szCs w:val="24"/>
-          <w:lang w:val="es-ES"/>
-        </w:rPr>
-      </w:pPr>
-      <w:r>
-        <w:rPr>
-          <w:rFonts w:ascii="Times New Roman" w:eastAsia="Times New Roman" w:hAnsi="Times New Roman" w:cs="Times New Roman"/>
-          <w:sz w:val="24"/>
-          <w:szCs w:val="24"/>
-          <w:lang w:val="es-ES"/>
-        </w:rPr>
-        <w:t xml:space="preserve">Ramírez‐Barahona, S., Cuervo‐Robayo, A. P., &amp; Magallón, S. (2023). </w:t>
-      </w:r>
-      <w:r>
-        <w:rPr>
-          <w:rFonts w:ascii="Times New Roman" w:eastAsia="Times New Roman" w:hAnsi="Times New Roman" w:cs="Times New Roman"/>
-          <w:sz w:val="24"/>
-          <w:szCs w:val="24"/>
-        </w:rPr>
-        <w:t xml:space="preserve">Assessing digital accessible botanical knowledge and priorities for exploration and discovery of plant diversity across Mesoamerica. </w:t>
-      </w:r>
-      <w:r>
-        <w:rPr>
-          <w:rFonts w:ascii="Times New Roman" w:eastAsia="Times New Roman" w:hAnsi="Times New Roman" w:cs="Times New Roman"/>
-          <w:i/>
-          <w:sz w:val="24"/>
-          <w:szCs w:val="24"/>
-          <w:lang w:val="es-ES"/>
-        </w:rPr>
-        <w:t>New Phytologist</w:t>
-      </w:r>
-      <w:r>
-        <w:rPr>
-          <w:rFonts w:ascii="Times New Roman" w:eastAsia="Times New Roman" w:hAnsi="Times New Roman" w:cs="Times New Roman"/>
-          <w:sz w:val="24"/>
-          <w:szCs w:val="24"/>
-          <w:lang w:val="es-ES"/>
-        </w:rPr>
-        <w:t xml:space="preserve">, </w:t>
-      </w:r>
-      <w:r>
-        <w:rPr>
-          <w:rFonts w:ascii="Times New Roman" w:eastAsia="Times New Roman" w:hAnsi="Times New Roman" w:cs="Times New Roman"/>
-          <w:i/>
-          <w:sz w:val="24"/>
-          <w:szCs w:val="24"/>
-          <w:lang w:val="es-ES"/>
-        </w:rPr>
-        <w:t>240</w:t>
-      </w:r>
-      <w:r>
-        <w:rPr>
-          <w:rFonts w:ascii="Times New Roman" w:eastAsia="Times New Roman" w:hAnsi="Times New Roman" w:cs="Times New Roman"/>
-          <w:sz w:val="24"/>
-          <w:szCs w:val="24"/>
-          <w:lang w:val="es-ES"/>
-        </w:rPr>
-        <w:t>(4), 1659–1672. https://doi.org/10.1111/nph.19190</w:t>
+        </w:rPr>
+      </w:pPr>
+      <w:r>
+        <w:rPr>
+          <w:rFonts w:ascii="Times New Roman" w:eastAsia="Times New Roman" w:hAnsi="Times New Roman" w:cs="Times New Roman"/>
+          <w:sz w:val="24"/>
+          <w:szCs w:val="24"/>
+        </w:rPr>
+        <w:t xml:space="preserve">R. Core Team. (2024). </w:t>
+      </w:r>
+      <w:r>
+        <w:rPr>
+          <w:rFonts w:ascii="Times New Roman" w:eastAsia="Times New Roman" w:hAnsi="Times New Roman" w:cs="Times New Roman"/>
+          <w:i/>
+          <w:sz w:val="24"/>
+          <w:szCs w:val="24"/>
+        </w:rPr>
+        <w:t>_R: A Language and Environment for Statistical Computing_</w:t>
+      </w:r>
+      <w:r>
+        <w:rPr>
+          <w:rFonts w:ascii="Times New Roman" w:eastAsia="Times New Roman" w:hAnsi="Times New Roman" w:cs="Times New Roman"/>
+          <w:sz w:val="24"/>
+          <w:szCs w:val="24"/>
+        </w:rPr>
+        <w:t xml:space="preserve"> [Computer software]. R Foundation for Statistical Computing. &lt;https://www.R-project.org/&gt;</w:t>
       </w:r>
     </w:p>
     <w:p>
@@ -8223,50 +8417,63 @@
           <w:rFonts w:ascii="Times New Roman" w:eastAsia="Times New Roman" w:hAnsi="Times New Roman" w:cs="Times New Roman"/>
           <w:sz w:val="24"/>
           <w:szCs w:val="24"/>
-        </w:rPr>
-      </w:pPr>
-      <w:r>
-        <w:rPr>
-          <w:rFonts w:ascii="Times New Roman" w:eastAsia="Times New Roman" w:hAnsi="Times New Roman" w:cs="Times New Roman"/>
-          <w:sz w:val="24"/>
-          <w:szCs w:val="24"/>
           <w:lang w:val="es-ES"/>
         </w:rPr>
-        <w:t xml:space="preserve">Ramos, F. N., De Araujo, M. L., Da Silva Assis, I., Basilio, G. A., Barbosa, D. E. F., Correa, T. A., Delgado, C. N., Furtado, S. G., Marquez, G., Soares, J. S., Yañez, A., Silva, S. M., Neto, L. M., &amp; Elias, J. P. C. (2024). </w:t>
-      </w:r>
-      <w:r>
-        <w:rPr>
-          <w:rFonts w:ascii="Times New Roman" w:eastAsia="Times New Roman" w:hAnsi="Times New Roman" w:cs="Times New Roman"/>
-          <w:sz w:val="24"/>
-          <w:szCs w:val="24"/>
-        </w:rPr>
-        <w:t xml:space="preserve">Vascular epiphytes of the South America Dry </w:t>
-      </w:r>
-      <w:r>
-        <w:rPr>
-          <w:rFonts w:ascii="Times New Roman" w:eastAsia="Times New Roman" w:hAnsi="Times New Roman" w:cs="Times New Roman"/>
-          <w:sz w:val="24"/>
-          <w:szCs w:val="24"/>
-        </w:rPr>
-        <w:lastRenderedPageBreak/>
-        <w:t xml:space="preserve">Diagonal: Characterising their occurrence and richness in this neglected region. </w:t>
-      </w:r>
-      <w:r>
-        <w:rPr>
-          <w:rFonts w:ascii="Times New Roman" w:eastAsia="Times New Roman" w:hAnsi="Times New Roman" w:cs="Times New Roman"/>
-          <w:i/>
-          <w:sz w:val="24"/>
-          <w:szCs w:val="24"/>
-        </w:rPr>
-        <w:t>New Zealand Journal of Botany</w:t>
-      </w:r>
-      <w:r>
-        <w:rPr>
-          <w:rFonts w:ascii="Times New Roman" w:eastAsia="Times New Roman" w:hAnsi="Times New Roman" w:cs="Times New Roman"/>
-          <w:sz w:val="24"/>
-          <w:szCs w:val="24"/>
-        </w:rPr>
-        <w:t>, 1–18. https://doi.org/10.1080/0028825X.2024.2387188</w:t>
+      </w:pPr>
+      <w:r>
+        <w:rPr>
+          <w:rFonts w:ascii="Times New Roman" w:eastAsia="Times New Roman" w:hAnsi="Times New Roman" w:cs="Times New Roman"/>
+          <w:sz w:val="24"/>
+          <w:szCs w:val="24"/>
+          <w:lang w:val="es-ES"/>
+        </w:rPr>
+        <w:t xml:space="preserve">Ramírez‐Barahona, S., Cuervo‐Robayo, A. P., &amp; Magallón, S. (2023). </w:t>
+      </w:r>
+      <w:r>
+        <w:rPr>
+          <w:rFonts w:ascii="Times New Roman" w:eastAsia="Times New Roman" w:hAnsi="Times New Roman" w:cs="Times New Roman"/>
+          <w:sz w:val="24"/>
+          <w:szCs w:val="24"/>
+        </w:rPr>
+        <w:t xml:space="preserve">Assessing digital accessible botanical knowledge and priorities for exploration and discovery of plant diversity across Mesoamerica. </w:t>
+      </w:r>
+      <w:r>
+        <w:rPr>
+          <w:rFonts w:ascii="Times New Roman" w:eastAsia="Times New Roman" w:hAnsi="Times New Roman" w:cs="Times New Roman"/>
+          <w:i/>
+          <w:sz w:val="24"/>
+          <w:szCs w:val="24"/>
+          <w:lang w:val="es-ES"/>
+        </w:rPr>
+        <w:t>New Phytologist</w:t>
+      </w:r>
+      <w:r>
+        <w:rPr>
+          <w:rFonts w:ascii="Times New Roman" w:eastAsia="Times New Roman" w:hAnsi="Times New Roman" w:cs="Times New Roman"/>
+          <w:sz w:val="24"/>
+          <w:szCs w:val="24"/>
+          <w:lang w:val="es-ES"/>
+        </w:rPr>
+        <w:t xml:space="preserve">, </w:t>
+      </w:r>
+      <w:r>
+        <w:rPr>
+          <w:rFonts w:ascii="Times New Roman" w:eastAsia="Times New Roman" w:hAnsi="Times New Roman" w:cs="Times New Roman"/>
+          <w:i/>
+          <w:sz w:val="24"/>
+          <w:szCs w:val="24"/>
+          <w:lang w:val="es-ES"/>
+        </w:rPr>
+        <w:t>240</w:t>
+      </w:r>
+      <w:r>
+        <w:rPr>
+          <w:rFonts w:ascii="Times New Roman" w:eastAsia="Times New Roman" w:hAnsi="Times New Roman" w:cs="Times New Roman"/>
+          <w:sz w:val="24"/>
+          <w:szCs w:val="24"/>
+          <w:lang w:val="es-ES"/>
+        </w:rPr>
+        <w:t>(4), 1659–1672. https://doi.org/10.1111/nph.19190</w:t>
       </w:r>
     </w:p>
     <w:p>
@@ -8291,25 +8498,43 @@
           <w:rFonts w:ascii="Times New Roman" w:eastAsia="Times New Roman" w:hAnsi="Times New Roman" w:cs="Times New Roman"/>
           <w:sz w:val="24"/>
           <w:szCs w:val="24"/>
-        </w:rPr>
-        <w:t xml:space="preserve">Ramos, F. N., Mortara, S. R., &amp; Elias, J. P. C. (2021). Vascular Epiphytes of the Atlantic Forest: Diversity and Community Ecology. In M. C. M. Marques &amp; C. E. V. Grelle (Eds.), </w:t>
-      </w:r>
-      <w:r>
-        <w:rPr>
-          <w:rFonts w:ascii="Times New Roman" w:eastAsia="Times New Roman" w:hAnsi="Times New Roman" w:cs="Times New Roman"/>
-          <w:i/>
-          <w:sz w:val="24"/>
-          <w:szCs w:val="24"/>
-        </w:rPr>
-        <w:t>The Atlantic Forest</w:t>
-      </w:r>
-      <w:r>
-        <w:rPr>
-          <w:rFonts w:ascii="Times New Roman" w:eastAsia="Times New Roman" w:hAnsi="Times New Roman" w:cs="Times New Roman"/>
-          <w:sz w:val="24"/>
-          <w:szCs w:val="24"/>
-        </w:rPr>
-        <w:t xml:space="preserve"> (pp. 133–149). Springer International Publishing. https://doi.org/10.1007/978-3-030-55322-7_7</w:t>
+          <w:lang w:val="es-ES"/>
+        </w:rPr>
+        <w:t xml:space="preserve">Ramos, F. N., De Araujo, M. L., Da Silva Assis, I., Basilio, G. A., Barbosa, D. E. F., Correa, T. A., Delgado, C. N., Furtado, S. G., Marquez, G., Soares, J. S., Yañez, A., Silva, S. M., Neto, L. M., &amp; Elias, J. P. C. (2024). </w:t>
+      </w:r>
+      <w:r>
+        <w:rPr>
+          <w:rFonts w:ascii="Times New Roman" w:eastAsia="Times New Roman" w:hAnsi="Times New Roman" w:cs="Times New Roman"/>
+          <w:sz w:val="24"/>
+          <w:szCs w:val="24"/>
+        </w:rPr>
+        <w:t xml:space="preserve">Vascular epiphytes of the South America Dry </w:t>
+      </w:r>
+      <w:r>
+        <w:rPr>
+          <w:rFonts w:ascii="Times New Roman" w:eastAsia="Times New Roman" w:hAnsi="Times New Roman" w:cs="Times New Roman"/>
+          <w:sz w:val="24"/>
+          <w:szCs w:val="24"/>
+        </w:rPr>
+        <w:lastRenderedPageBreak/>
+        <w:t xml:space="preserve">Diagonal: Characterising their occurrence and richness in this neglected region. </w:t>
+      </w:r>
+      <w:r>
+        <w:rPr>
+          <w:rFonts w:ascii="Times New Roman" w:eastAsia="Times New Roman" w:hAnsi="Times New Roman" w:cs="Times New Roman"/>
+          <w:i/>
+          <w:sz w:val="24"/>
+          <w:szCs w:val="24"/>
+        </w:rPr>
+        <w:t>New Zealand Journal of Botany</w:t>
+      </w:r>
+      <w:r>
+        <w:rPr>
+          <w:rFonts w:ascii="Times New Roman" w:eastAsia="Times New Roman" w:hAnsi="Times New Roman" w:cs="Times New Roman"/>
+          <w:sz w:val="24"/>
+          <w:szCs w:val="24"/>
+        </w:rPr>
+        <w:t>, 1–18. https://doi.org/10.1080/0028825X.2024.2387188</w:t>
       </w:r>
     </w:p>
     <w:p>
@@ -8335,41 +8560,24 @@
           <w:sz w:val="24"/>
           <w:szCs w:val="24"/>
         </w:rPr>
-        <w:t xml:space="preserve">Ramos, F. N., Mortara, S. R., Monalisa‐Francisco, N., Elias, J. P. C., Neto, L. M., Freitas, L., Kersten, R., Amorim, A. M., Matos, F. B., Nunes‐Freitas, A. F., Alcantara, S., Alexandre, M. H. N., Almeida‐Scabbia, R. J., Almeida, O. J. G., Alves, F. E., Oliveira Alves, R. M., Alvim, F. S., Andrade, A. C. S., Andrade, S., … Ribeiro, M. C. (2019). ATLANTIC EPIPHYTES: A data set of vascular and non‐vascular epiphyte plants and lichens from the Atlantic Forest. </w:t>
-      </w:r>
-      <w:r>
-        <w:rPr>
-          <w:rFonts w:ascii="Times New Roman" w:eastAsia="Times New Roman" w:hAnsi="Times New Roman" w:cs="Times New Roman"/>
-          <w:i/>
-          <w:sz w:val="24"/>
-          <w:szCs w:val="24"/>
-        </w:rPr>
-        <w:t>Ecology</w:t>
-      </w:r>
-      <w:r>
-        <w:rPr>
-          <w:rFonts w:ascii="Times New Roman" w:eastAsia="Times New Roman" w:hAnsi="Times New Roman" w:cs="Times New Roman"/>
-          <w:sz w:val="24"/>
-          <w:szCs w:val="24"/>
-        </w:rPr>
-        <w:t xml:space="preserve">, </w:t>
-      </w:r>
-      <w:r>
-        <w:rPr>
-          <w:rFonts w:ascii="Times New Roman" w:eastAsia="Times New Roman" w:hAnsi="Times New Roman" w:cs="Times New Roman"/>
-          <w:i/>
-          <w:sz w:val="24"/>
-          <w:szCs w:val="24"/>
-        </w:rPr>
-        <w:t>100</w:t>
-      </w:r>
-      <w:r>
-        <w:rPr>
-          <w:rFonts w:ascii="Times New Roman" w:eastAsia="Times New Roman" w:hAnsi="Times New Roman" w:cs="Times New Roman"/>
-          <w:sz w:val="24"/>
-          <w:szCs w:val="24"/>
-        </w:rPr>
-        <w:t>(2), e02541. https://doi.org/10.1002/ecy.2541</w:t>
+        <w:t xml:space="preserve">Ramos, F. N., Mortara, S. R., &amp; Elias, J. P. C. (2021). Vascular Epiphytes of the Atlantic Forest: Diversity and Community Ecology. In M. C. M. Marques &amp; C. E. V. Grelle (Eds.), </w:t>
+      </w:r>
+      <w:r>
+        <w:rPr>
+          <w:rFonts w:ascii="Times New Roman" w:eastAsia="Times New Roman" w:hAnsi="Times New Roman" w:cs="Times New Roman"/>
+          <w:i/>
+          <w:sz w:val="24"/>
+          <w:szCs w:val="24"/>
+        </w:rPr>
+        <w:t>The Atlantic Forest</w:t>
+      </w:r>
+      <w:r>
+        <w:rPr>
+          <w:rFonts w:ascii="Times New Roman" w:eastAsia="Times New Roman" w:hAnsi="Times New Roman" w:cs="Times New Roman"/>
+          <w:sz w:val="24"/>
+          <w:szCs w:val="24"/>
+        </w:rPr>
+        <w:t xml:space="preserve"> (pp. 133–149). Springer International Publishing. https://doi.org/10.1007/978-3-030-55322-7_7</w:t>
       </w:r>
     </w:p>
     <w:p>
@@ -8395,16 +8603,16 @@
           <w:sz w:val="24"/>
           <w:szCs w:val="24"/>
         </w:rPr>
-        <w:t xml:space="preserve">Raven, P. H., Gereau, R. E., Phillipson, P. B., Chatelain, C., Jenkins, C. N., &amp; Ulloa Ulloa, C. (2020). The distribution of biodiversity richness in the tropics. </w:t>
-      </w:r>
-      <w:r>
-        <w:rPr>
-          <w:rFonts w:ascii="Times New Roman" w:eastAsia="Times New Roman" w:hAnsi="Times New Roman" w:cs="Times New Roman"/>
-          <w:i/>
-          <w:sz w:val="24"/>
-          <w:szCs w:val="24"/>
-        </w:rPr>
-        <w:t>Science Advances</w:t>
+        <w:t xml:space="preserve">Ramos, F. N., Mortara, S. R., Monalisa‐Francisco, N., Elias, J. P. C., Neto, L. M., Freitas, L., Kersten, R., Amorim, A. M., Matos, F. B., Nunes‐Freitas, A. F., Alcantara, S., Alexandre, M. H. N., Almeida‐Scabbia, R. J., Almeida, O. J. G., Alves, F. E., Oliveira Alves, R. M., Alvim, F. S., Andrade, A. C. S., Andrade, S., … Ribeiro, M. C. (2019). ATLANTIC EPIPHYTES: A data set of vascular and non‐vascular epiphyte plants and lichens from the Atlantic Forest. </w:t>
+      </w:r>
+      <w:r>
+        <w:rPr>
+          <w:rFonts w:ascii="Times New Roman" w:eastAsia="Times New Roman" w:hAnsi="Times New Roman" w:cs="Times New Roman"/>
+          <w:i/>
+          <w:sz w:val="24"/>
+          <w:szCs w:val="24"/>
+        </w:rPr>
+        <w:t>Ecology</w:t>
       </w:r>
       <w:r>
         <w:rPr>
@@ -8421,15 +8629,15 @@
           <w:sz w:val="24"/>
           <w:szCs w:val="24"/>
         </w:rPr>
-        <w:t>6</w:t>
-      </w:r>
-      <w:r>
-        <w:rPr>
-          <w:rFonts w:ascii="Times New Roman" w:eastAsia="Times New Roman" w:hAnsi="Times New Roman" w:cs="Times New Roman"/>
-          <w:sz w:val="24"/>
-          <w:szCs w:val="24"/>
-        </w:rPr>
-        <w:t xml:space="preserve">(37), eabc6228. https://doi.org/10.1126/sciadv.abc6228 </w:t>
+        <w:t>100</w:t>
+      </w:r>
+      <w:r>
+        <w:rPr>
+          <w:rFonts w:ascii="Times New Roman" w:eastAsia="Times New Roman" w:hAnsi="Times New Roman" w:cs="Times New Roman"/>
+          <w:sz w:val="24"/>
+          <w:szCs w:val="24"/>
+        </w:rPr>
+        <w:t>(2), e02541. https://doi.org/10.1002/ecy.2541</w:t>
       </w:r>
     </w:p>
     <w:p>
@@ -8455,16 +8663,16 @@
           <w:sz w:val="24"/>
           <w:szCs w:val="24"/>
         </w:rPr>
-        <w:t xml:space="preserve">Rossi, F., &amp; Becker, G. (2019). Creating forest management units with Hot Spot Analysis (Getis-Ord Gi*) over a forest affected by mixed-severity fires. </w:t>
-      </w:r>
-      <w:r>
-        <w:rPr>
-          <w:rFonts w:ascii="Times New Roman" w:eastAsia="Times New Roman" w:hAnsi="Times New Roman" w:cs="Times New Roman"/>
-          <w:i/>
-          <w:sz w:val="24"/>
-          <w:szCs w:val="24"/>
-        </w:rPr>
-        <w:t>Australian Forestry</w:t>
+        <w:t xml:space="preserve">Raven, P. H., Gereau, R. E., Phillipson, P. B., Chatelain, C., Jenkins, C. N., &amp; Ulloa Ulloa, C. (2020). The distribution of biodiversity richness in the tropics. </w:t>
+      </w:r>
+      <w:r>
+        <w:rPr>
+          <w:rFonts w:ascii="Times New Roman" w:eastAsia="Times New Roman" w:hAnsi="Times New Roman" w:cs="Times New Roman"/>
+          <w:i/>
+          <w:sz w:val="24"/>
+          <w:szCs w:val="24"/>
+        </w:rPr>
+        <w:t>Science Advances</w:t>
       </w:r>
       <w:r>
         <w:rPr>
@@ -8481,15 +8689,15 @@
           <w:sz w:val="24"/>
           <w:szCs w:val="24"/>
         </w:rPr>
-        <w:t>82</w:t>
-      </w:r>
-      <w:r>
-        <w:rPr>
-          <w:rFonts w:ascii="Times New Roman" w:eastAsia="Times New Roman" w:hAnsi="Times New Roman" w:cs="Times New Roman"/>
-          <w:sz w:val="24"/>
-          <w:szCs w:val="24"/>
-        </w:rPr>
-        <w:t>(4), 166–175. https://doi.org/10.1080/00049158.2019.1678714</w:t>
+        <w:t>6</w:t>
+      </w:r>
+      <w:r>
+        <w:rPr>
+          <w:rFonts w:ascii="Times New Roman" w:eastAsia="Times New Roman" w:hAnsi="Times New Roman" w:cs="Times New Roman"/>
+          <w:sz w:val="24"/>
+          <w:szCs w:val="24"/>
+        </w:rPr>
+        <w:t xml:space="preserve">(37), eabc6228. https://doi.org/10.1126/sciadv.abc6228 </w:t>
       </w:r>
     </w:p>
     <w:p>
@@ -8509,6 +8717,48 @@
           <w:szCs w:val="24"/>
         </w:rPr>
       </w:pPr>
+      <w:r>
+        <w:rPr>
+          <w:rFonts w:ascii="Times New Roman" w:eastAsia="Times New Roman" w:hAnsi="Times New Roman" w:cs="Times New Roman"/>
+          <w:sz w:val="24"/>
+          <w:szCs w:val="24"/>
+        </w:rPr>
+        <w:t xml:space="preserve">Rossi, F., &amp; Becker, G. (2019). Creating forest management units with Hot Spot Analysis (Getis-Ord Gi*) over a forest affected by mixed-severity fires. </w:t>
+      </w:r>
+      <w:r>
+        <w:rPr>
+          <w:rFonts w:ascii="Times New Roman" w:eastAsia="Times New Roman" w:hAnsi="Times New Roman" w:cs="Times New Roman"/>
+          <w:i/>
+          <w:sz w:val="24"/>
+          <w:szCs w:val="24"/>
+        </w:rPr>
+        <w:t>Australian Forestry</w:t>
+      </w:r>
+      <w:r>
+        <w:rPr>
+          <w:rFonts w:ascii="Times New Roman" w:eastAsia="Times New Roman" w:hAnsi="Times New Roman" w:cs="Times New Roman"/>
+          <w:sz w:val="24"/>
+          <w:szCs w:val="24"/>
+        </w:rPr>
+        <w:t xml:space="preserve">, </w:t>
+      </w:r>
+      <w:r>
+        <w:rPr>
+          <w:rFonts w:ascii="Times New Roman" w:eastAsia="Times New Roman" w:hAnsi="Times New Roman" w:cs="Times New Roman"/>
+          <w:i/>
+          <w:sz w:val="24"/>
+          <w:szCs w:val="24"/>
+        </w:rPr>
+        <w:t>82</w:t>
+      </w:r>
+      <w:r>
+        <w:rPr>
+          <w:rFonts w:ascii="Times New Roman" w:eastAsia="Times New Roman" w:hAnsi="Times New Roman" w:cs="Times New Roman"/>
+          <w:sz w:val="24"/>
+          <w:szCs w:val="24"/>
+        </w:rPr>
+        <w:t>(4), 166–175. https://doi.org/10.1080/00049158.2019.1678714</w:t>
+      </w:r>
     </w:p>
     <w:p>
       <w:pPr>
@@ -8527,49 +8777,6 @@
           <w:szCs w:val="24"/>
         </w:rPr>
       </w:pPr>
-      <w:r>
-        <w:rPr>
-          <w:rFonts w:ascii="Times New Roman" w:eastAsia="Times New Roman" w:hAnsi="Times New Roman" w:cs="Times New Roman"/>
-          <w:sz w:val="24"/>
-          <w:szCs w:val="24"/>
-        </w:rPr>
-        <w:lastRenderedPageBreak/>
-        <w:t xml:space="preserve">Roy, M., Vasco‐Palacios, A., Geml, J., Buyck, B., Delgat, L., Giachini, A., Grebenc, T., Harrower, E., Kuhar, F., Magnago, A., Rinaldi, A. C., Schimann, H., Selosse, M., Sulzbacher, M. A., Wartchow, F., &amp; Neves, M. (2017). The (re)discovery of ectomycorrhizal symbioses in Neotropical ecosystems sketched in Florianópolis. </w:t>
-      </w:r>
-      <w:r>
-        <w:rPr>
-          <w:rFonts w:ascii="Times New Roman" w:eastAsia="Times New Roman" w:hAnsi="Times New Roman" w:cs="Times New Roman"/>
-          <w:i/>
-          <w:sz w:val="24"/>
-          <w:szCs w:val="24"/>
-        </w:rPr>
-        <w:t>New Phytologist</w:t>
-      </w:r>
-      <w:r>
-        <w:rPr>
-          <w:rFonts w:ascii="Times New Roman" w:eastAsia="Times New Roman" w:hAnsi="Times New Roman" w:cs="Times New Roman"/>
-          <w:sz w:val="24"/>
-          <w:szCs w:val="24"/>
-        </w:rPr>
-        <w:t xml:space="preserve">, </w:t>
-      </w:r>
-      <w:r>
-        <w:rPr>
-          <w:rFonts w:ascii="Times New Roman" w:eastAsia="Times New Roman" w:hAnsi="Times New Roman" w:cs="Times New Roman"/>
-          <w:i/>
-          <w:sz w:val="24"/>
-          <w:szCs w:val="24"/>
-        </w:rPr>
-        <w:t>214</w:t>
-      </w:r>
-      <w:r>
-        <w:rPr>
-          <w:rFonts w:ascii="Times New Roman" w:eastAsia="Times New Roman" w:hAnsi="Times New Roman" w:cs="Times New Roman"/>
-          <w:sz w:val="24"/>
-          <w:szCs w:val="24"/>
-        </w:rPr>
-        <w:t>(3), 920–923. https://doi.org/10.1111/nph.14531</w:t>
-      </w:r>
     </w:p>
     <w:p>
       <w:pPr>
@@ -8594,16 +8801,17 @@
           <w:sz w:val="24"/>
           <w:szCs w:val="24"/>
         </w:rPr>
-        <w:t xml:space="preserve">Sabatini, F. M., Jiménez-Alfaro, B., Jandt, U., Chytrý, M., Field, R., Kessler, M., Lenoir, J., Schrodt, F., Wiser, S. K., Arfin Khan, M. A. S., Attorre, F., Cayuela, L., De Sanctis, M., Dengler, J., Haider, S., Hatim, M. Z., Indreica, A., Jansen, F., Pauchard, A., … Bruelheide, H. (2022). Global patterns of vascular plant alpha diversity. </w:t>
-      </w:r>
-      <w:r>
-        <w:rPr>
-          <w:rFonts w:ascii="Times New Roman" w:eastAsia="Times New Roman" w:hAnsi="Times New Roman" w:cs="Times New Roman"/>
-          <w:i/>
-          <w:sz w:val="24"/>
-          <w:szCs w:val="24"/>
-        </w:rPr>
-        <w:t>Nature Communications</w:t>
+        <w:lastRenderedPageBreak/>
+        <w:t xml:space="preserve">Roy, M., Vasco‐Palacios, A., Geml, J., Buyck, B., Delgat, L., Giachini, A., Grebenc, T., Harrower, E., Kuhar, F., Magnago, A., Rinaldi, A. C., Schimann, H., Selosse, M., Sulzbacher, M. A., Wartchow, F., &amp; Neves, M. (2017). The (re)discovery of ectomycorrhizal symbioses in Neotropical ecosystems sketched in Florianópolis. </w:t>
+      </w:r>
+      <w:r>
+        <w:rPr>
+          <w:rFonts w:ascii="Times New Roman" w:eastAsia="Times New Roman" w:hAnsi="Times New Roman" w:cs="Times New Roman"/>
+          <w:i/>
+          <w:sz w:val="24"/>
+          <w:szCs w:val="24"/>
+        </w:rPr>
+        <w:t>New Phytologist</w:t>
       </w:r>
       <w:r>
         <w:rPr>
@@ -8620,15 +8828,15 @@
           <w:sz w:val="24"/>
           <w:szCs w:val="24"/>
         </w:rPr>
-        <w:t>13</w:t>
-      </w:r>
-      <w:r>
-        <w:rPr>
-          <w:rFonts w:ascii="Times New Roman" w:eastAsia="Times New Roman" w:hAnsi="Times New Roman" w:cs="Times New Roman"/>
-          <w:sz w:val="24"/>
-          <w:szCs w:val="24"/>
-        </w:rPr>
-        <w:t>(1), 4683. https://doi.org/10.1038/s41467-022-32063-z</w:t>
+        <w:t>214</w:t>
+      </w:r>
+      <w:r>
+        <w:rPr>
+          <w:rFonts w:ascii="Times New Roman" w:eastAsia="Times New Roman" w:hAnsi="Times New Roman" w:cs="Times New Roman"/>
+          <w:sz w:val="24"/>
+          <w:szCs w:val="24"/>
+        </w:rPr>
+        <w:t>(3), 920–923. https://doi.org/10.1111/nph.14531</w:t>
       </w:r>
     </w:p>
     <w:p>
@@ -8646,33 +8854,30 @@
           <w:rFonts w:ascii="Times New Roman" w:eastAsia="Times New Roman" w:hAnsi="Times New Roman" w:cs="Times New Roman"/>
           <w:sz w:val="24"/>
           <w:szCs w:val="24"/>
-          <w:lang w:val="de-DE"/>
-        </w:rPr>
-      </w:pPr>
-      <w:r>
-        <w:rPr>
-          <w:rFonts w:ascii="Times New Roman" w:eastAsia="Times New Roman" w:hAnsi="Times New Roman" w:cs="Times New Roman"/>
-          <w:sz w:val="24"/>
-          <w:szCs w:val="24"/>
-        </w:rPr>
-        <w:t xml:space="preserve">Schellenberger Costa, D., Boehnisch, G., Freiberg, M., Govaerts, R., Grenié, M., Hassler, M., Kattge, J., Muellner‐Riehl, A. N., Rojas Andrés, B. M., Winter, M., Watson, M., Zizka, A., &amp; Wirth, C. (2023). The big four of plant taxonomy – a comparison of global checklists of vascular plant names. </w:t>
-      </w:r>
-      <w:r>
-        <w:rPr>
-          <w:rFonts w:ascii="Times New Roman" w:eastAsia="Times New Roman" w:hAnsi="Times New Roman" w:cs="Times New Roman"/>
-          <w:i/>
-          <w:sz w:val="24"/>
-          <w:szCs w:val="24"/>
-          <w:lang w:val="de-DE"/>
-        </w:rPr>
-        <w:t>New Phytologist</w:t>
-      </w:r>
-      <w:r>
-        <w:rPr>
-          <w:rFonts w:ascii="Times New Roman" w:eastAsia="Times New Roman" w:hAnsi="Times New Roman" w:cs="Times New Roman"/>
-          <w:sz w:val="24"/>
-          <w:szCs w:val="24"/>
-          <w:lang w:val="de-DE"/>
+        </w:rPr>
+      </w:pPr>
+      <w:r>
+        <w:rPr>
+          <w:rFonts w:ascii="Times New Roman" w:eastAsia="Times New Roman" w:hAnsi="Times New Roman" w:cs="Times New Roman"/>
+          <w:sz w:val="24"/>
+          <w:szCs w:val="24"/>
+        </w:rPr>
+        <w:t xml:space="preserve">Sabatini, F. M., Jiménez-Alfaro, B., Jandt, U., Chytrý, M., Field, R., Kessler, M., Lenoir, J., Schrodt, F., Wiser, S. K., Arfin Khan, M. A. S., Attorre, F., Cayuela, L., De Sanctis, M., Dengler, J., Haider, S., Hatim, M. Z., Indreica, A., Jansen, F., Pauchard, A., … Bruelheide, H. (2022). Global patterns of vascular plant alpha diversity. </w:t>
+      </w:r>
+      <w:r>
+        <w:rPr>
+          <w:rFonts w:ascii="Times New Roman" w:eastAsia="Times New Roman" w:hAnsi="Times New Roman" w:cs="Times New Roman"/>
+          <w:i/>
+          <w:sz w:val="24"/>
+          <w:szCs w:val="24"/>
+        </w:rPr>
+        <w:t>Nature Communications</w:t>
+      </w:r>
+      <w:r>
+        <w:rPr>
+          <w:rFonts w:ascii="Times New Roman" w:eastAsia="Times New Roman" w:hAnsi="Times New Roman" w:cs="Times New Roman"/>
+          <w:sz w:val="24"/>
+          <w:szCs w:val="24"/>
         </w:rPr>
         <w:t xml:space="preserve">, </w:t>
       </w:r>
@@ -8682,18 +8887,16 @@
           <w:i/>
           <w:sz w:val="24"/>
           <w:szCs w:val="24"/>
-          <w:lang w:val="de-DE"/>
-        </w:rPr>
-        <w:t>240</w:t>
-      </w:r>
-      <w:r>
-        <w:rPr>
-          <w:rFonts w:ascii="Times New Roman" w:eastAsia="Times New Roman" w:hAnsi="Times New Roman" w:cs="Times New Roman"/>
-          <w:sz w:val="24"/>
-          <w:szCs w:val="24"/>
-          <w:lang w:val="de-DE"/>
-        </w:rPr>
-        <w:t>(4), 1687–1702. https://doi.org/10.1111/nph.18961</w:t>
+        </w:rPr>
+        <w:t>13</w:t>
+      </w:r>
+      <w:r>
+        <w:rPr>
+          <w:rFonts w:ascii="Times New Roman" w:eastAsia="Times New Roman" w:hAnsi="Times New Roman" w:cs="Times New Roman"/>
+          <w:sz w:val="24"/>
+          <w:szCs w:val="24"/>
+        </w:rPr>
+        <w:t>(1), 4683. https://doi.org/10.1038/s41467-022-32063-z</w:t>
       </w:r>
     </w:p>
     <w:p>
@@ -8711,39 +8914,33 @@
           <w:rFonts w:ascii="Times New Roman" w:eastAsia="Times New Roman" w:hAnsi="Times New Roman" w:cs="Times New Roman"/>
           <w:sz w:val="24"/>
           <w:szCs w:val="24"/>
-        </w:rPr>
-      </w:pPr>
-      <w:r>
-        <w:rPr>
-          <w:rFonts w:ascii="Times New Roman" w:eastAsia="Times New Roman" w:hAnsi="Times New Roman" w:cs="Times New Roman"/>
-          <w:sz w:val="24"/>
-          <w:szCs w:val="24"/>
           <w:lang w:val="de-DE"/>
         </w:rPr>
-        <w:t xml:space="preserve">Schröter, M., Kraemer, R., Ceauşu, S., &amp; Rusch, G. M. (2017). </w:t>
-      </w:r>
-      <w:r>
-        <w:rPr>
-          <w:rFonts w:ascii="Times New Roman" w:eastAsia="Times New Roman" w:hAnsi="Times New Roman" w:cs="Times New Roman"/>
-          <w:sz w:val="24"/>
-          <w:szCs w:val="24"/>
-        </w:rPr>
-        <w:t xml:space="preserve">Incorporating threat in hotspots and coldspots of biodiversity and ecosystem services. </w:t>
-      </w:r>
-      <w:r>
-        <w:rPr>
-          <w:rFonts w:ascii="Times New Roman" w:eastAsia="Times New Roman" w:hAnsi="Times New Roman" w:cs="Times New Roman"/>
-          <w:i/>
-          <w:sz w:val="24"/>
-          <w:szCs w:val="24"/>
-        </w:rPr>
-        <w:t>Ambio</w:t>
-      </w:r>
-      <w:r>
-        <w:rPr>
-          <w:rFonts w:ascii="Times New Roman" w:eastAsia="Times New Roman" w:hAnsi="Times New Roman" w:cs="Times New Roman"/>
-          <w:sz w:val="24"/>
-          <w:szCs w:val="24"/>
+      </w:pPr>
+      <w:r>
+        <w:rPr>
+          <w:rFonts w:ascii="Times New Roman" w:eastAsia="Times New Roman" w:hAnsi="Times New Roman" w:cs="Times New Roman"/>
+          <w:sz w:val="24"/>
+          <w:szCs w:val="24"/>
+        </w:rPr>
+        <w:t xml:space="preserve">Schellenberger Costa, D., Boehnisch, G., Freiberg, M., Govaerts, R., Grenié, M., Hassler, M., Kattge, J., Muellner‐Riehl, A. N., Rojas Andrés, B. M., Winter, M., Watson, M., Zizka, A., &amp; Wirth, C. (2023). The big four of plant taxonomy – a comparison of global checklists of vascular plant names. </w:t>
+      </w:r>
+      <w:r>
+        <w:rPr>
+          <w:rFonts w:ascii="Times New Roman" w:eastAsia="Times New Roman" w:hAnsi="Times New Roman" w:cs="Times New Roman"/>
+          <w:i/>
+          <w:sz w:val="24"/>
+          <w:szCs w:val="24"/>
+          <w:lang w:val="de-DE"/>
+        </w:rPr>
+        <w:t>New Phytologist</w:t>
+      </w:r>
+      <w:r>
+        <w:rPr>
+          <w:rFonts w:ascii="Times New Roman" w:eastAsia="Times New Roman" w:hAnsi="Times New Roman" w:cs="Times New Roman"/>
+          <w:sz w:val="24"/>
+          <w:szCs w:val="24"/>
+          <w:lang w:val="de-DE"/>
         </w:rPr>
         <w:t xml:space="preserve">, </w:t>
       </w:r>
@@ -8753,16 +8950,18 @@
           <w:i/>
           <w:sz w:val="24"/>
           <w:szCs w:val="24"/>
-        </w:rPr>
-        <w:t>46</w:t>
-      </w:r>
-      <w:r>
-        <w:rPr>
-          <w:rFonts w:ascii="Times New Roman" w:eastAsia="Times New Roman" w:hAnsi="Times New Roman" w:cs="Times New Roman"/>
-          <w:sz w:val="24"/>
-          <w:szCs w:val="24"/>
-        </w:rPr>
-        <w:t>(7), 756–768. https://doi.org/10.1007/s13280-017-0922-x</w:t>
+          <w:lang w:val="de-DE"/>
+        </w:rPr>
+        <w:t>240</w:t>
+      </w:r>
+      <w:r>
+        <w:rPr>
+          <w:rFonts w:ascii="Times New Roman" w:eastAsia="Times New Roman" w:hAnsi="Times New Roman" w:cs="Times New Roman"/>
+          <w:sz w:val="24"/>
+          <w:szCs w:val="24"/>
+          <w:lang w:val="de-DE"/>
+        </w:rPr>
+        <w:t>(4), 1687–1702. https://doi.org/10.1111/nph.18961</w:t>
       </w:r>
     </w:p>
     <w:p>
@@ -8787,26 +8986,26 @@
           <w:rFonts w:ascii="Times New Roman" w:eastAsia="Times New Roman" w:hAnsi="Times New Roman" w:cs="Times New Roman"/>
           <w:sz w:val="24"/>
           <w:szCs w:val="24"/>
-        </w:rPr>
-        <w:t xml:space="preserve">Soberón, J., &amp; Peterson, A. T. (2009). Monitoring Biodiversity Loss with Primary Species-occurrence Data: Toward National-level Indicators for the 2010 Target of the Convention </w:t>
-      </w:r>
-      <w:r>
-        <w:rPr>
-          <w:rFonts w:ascii="Times New Roman" w:eastAsia="Times New Roman" w:hAnsi="Times New Roman" w:cs="Times New Roman"/>
-          <w:sz w:val="24"/>
-          <w:szCs w:val="24"/>
-        </w:rPr>
-        <w:lastRenderedPageBreak/>
-        <w:t xml:space="preserve">on Biological Diversity. </w:t>
-      </w:r>
-      <w:r>
-        <w:rPr>
-          <w:rFonts w:ascii="Times New Roman" w:eastAsia="Times New Roman" w:hAnsi="Times New Roman" w:cs="Times New Roman"/>
-          <w:i/>
-          <w:sz w:val="24"/>
-          <w:szCs w:val="24"/>
-        </w:rPr>
-        <w:t>AMBIO: A Journal of the Human Environment</w:t>
+          <w:lang w:val="de-DE"/>
+        </w:rPr>
+        <w:t xml:space="preserve">Schröter, M., Kraemer, R., Ceauşu, S., &amp; Rusch, G. M. (2017). </w:t>
+      </w:r>
+      <w:r>
+        <w:rPr>
+          <w:rFonts w:ascii="Times New Roman" w:eastAsia="Times New Roman" w:hAnsi="Times New Roman" w:cs="Times New Roman"/>
+          <w:sz w:val="24"/>
+          <w:szCs w:val="24"/>
+        </w:rPr>
+        <w:t xml:space="preserve">Incorporating threat in hotspots and coldspots of biodiversity and ecosystem services. </w:t>
+      </w:r>
+      <w:r>
+        <w:rPr>
+          <w:rFonts w:ascii="Times New Roman" w:eastAsia="Times New Roman" w:hAnsi="Times New Roman" w:cs="Times New Roman"/>
+          <w:i/>
+          <w:sz w:val="24"/>
+          <w:szCs w:val="24"/>
+        </w:rPr>
+        <w:t>Ambio</w:t>
       </w:r>
       <w:r>
         <w:rPr>
@@ -8823,15 +9022,15 @@
           <w:sz w:val="24"/>
           <w:szCs w:val="24"/>
         </w:rPr>
-        <w:t>38</w:t>
-      </w:r>
-      <w:r>
-        <w:rPr>
-          <w:rFonts w:ascii="Times New Roman" w:eastAsia="Times New Roman" w:hAnsi="Times New Roman" w:cs="Times New Roman"/>
-          <w:sz w:val="24"/>
-          <w:szCs w:val="24"/>
-        </w:rPr>
-        <w:t>(1), 29–34. https://doi.org/10.1579/0044-7447-38.1.29</w:t>
+        <w:t>46</w:t>
+      </w:r>
+      <w:r>
+        <w:rPr>
+          <w:rFonts w:ascii="Times New Roman" w:eastAsia="Times New Roman" w:hAnsi="Times New Roman" w:cs="Times New Roman"/>
+          <w:sz w:val="24"/>
+          <w:szCs w:val="24"/>
+        </w:rPr>
+        <w:t>(7), 756–768. https://doi.org/10.1007/s13280-017-0922-x</w:t>
       </w:r>
     </w:p>
     <w:p>
@@ -8857,16 +9056,25 @@
           <w:sz w:val="24"/>
           <w:szCs w:val="24"/>
         </w:rPr>
-        <w:t xml:space="preserve">Sobral-Souza, T., Stropp, J., Santos, J. P., Prasniewski, V. M., Szinwelski, N., Vilela, B., Freitas, A. V. L., Ribeiro, M. C., &amp; Hortal, J. (2021). Knowledge gaps hamper understanding the relationship between fragmentation and biodiversity loss: The case of Atlantic Forest fruit-feeding butterflies. </w:t>
-      </w:r>
-      <w:r>
-        <w:rPr>
-          <w:rFonts w:ascii="Times New Roman" w:eastAsia="Times New Roman" w:hAnsi="Times New Roman" w:cs="Times New Roman"/>
-          <w:i/>
-          <w:sz w:val="24"/>
-          <w:szCs w:val="24"/>
-        </w:rPr>
-        <w:t>PeerJ</w:t>
+        <w:t xml:space="preserve">Soberón, J., &amp; Peterson, A. T. (2009). Monitoring Biodiversity Loss with Primary Species-occurrence Data: Toward National-level Indicators for the 2010 Target of the Convention </w:t>
+      </w:r>
+      <w:r>
+        <w:rPr>
+          <w:rFonts w:ascii="Times New Roman" w:eastAsia="Times New Roman" w:hAnsi="Times New Roman" w:cs="Times New Roman"/>
+          <w:sz w:val="24"/>
+          <w:szCs w:val="24"/>
+        </w:rPr>
+        <w:lastRenderedPageBreak/>
+        <w:t xml:space="preserve">on Biological Diversity. </w:t>
+      </w:r>
+      <w:r>
+        <w:rPr>
+          <w:rFonts w:ascii="Times New Roman" w:eastAsia="Times New Roman" w:hAnsi="Times New Roman" w:cs="Times New Roman"/>
+          <w:i/>
+          <w:sz w:val="24"/>
+          <w:szCs w:val="24"/>
+        </w:rPr>
+        <w:t>AMBIO: A Journal of the Human Environment</w:t>
       </w:r>
       <w:r>
         <w:rPr>
@@ -8883,15 +9091,15 @@
           <w:sz w:val="24"/>
           <w:szCs w:val="24"/>
         </w:rPr>
-        <w:t>9</w:t>
-      </w:r>
-      <w:r>
-        <w:rPr>
-          <w:rFonts w:ascii="Times New Roman" w:eastAsia="Times New Roman" w:hAnsi="Times New Roman" w:cs="Times New Roman"/>
-          <w:sz w:val="24"/>
-          <w:szCs w:val="24"/>
-        </w:rPr>
-        <w:t>, e11673. https://doi.org/10.7717/peerj.11673</w:t>
+        <w:t>38</w:t>
+      </w:r>
+      <w:r>
+        <w:rPr>
+          <w:rFonts w:ascii="Times New Roman" w:eastAsia="Times New Roman" w:hAnsi="Times New Roman" w:cs="Times New Roman"/>
+          <w:sz w:val="24"/>
+          <w:szCs w:val="24"/>
+        </w:rPr>
+        <w:t>(1), 29–34. https://doi.org/10.1579/0044-7447-38.1.29</w:t>
       </w:r>
     </w:p>
     <w:p>
@@ -8917,16 +9125,16 @@
           <w:sz w:val="24"/>
           <w:szCs w:val="24"/>
         </w:rPr>
-        <w:t xml:space="preserve">Stropp, J., Ladle, R. J., M. Malhado, A. C., Hortal, J., Gaffuri, J., H. Temperley, W., Olav Skøien, J., &amp; Mayaux, P. (2016). Mapping ignorance: 300 years of collecting flowering plants in Africa. </w:t>
-      </w:r>
-      <w:r>
-        <w:rPr>
-          <w:rFonts w:ascii="Times New Roman" w:eastAsia="Times New Roman" w:hAnsi="Times New Roman" w:cs="Times New Roman"/>
-          <w:i/>
-          <w:sz w:val="24"/>
-          <w:szCs w:val="24"/>
-        </w:rPr>
-        <w:t>Global Ecology and Biogeography</w:t>
+        <w:t xml:space="preserve">Sobral-Souza, T., Stropp, J., Santos, J. P., Prasniewski, V. M., Szinwelski, N., Vilela, B., Freitas, A. V. L., Ribeiro, M. C., &amp; Hortal, J. (2021). Knowledge gaps hamper understanding the relationship between fragmentation and biodiversity loss: The case of Atlantic Forest fruit-feeding butterflies. </w:t>
+      </w:r>
+      <w:r>
+        <w:rPr>
+          <w:rFonts w:ascii="Times New Roman" w:eastAsia="Times New Roman" w:hAnsi="Times New Roman" w:cs="Times New Roman"/>
+          <w:i/>
+          <w:sz w:val="24"/>
+          <w:szCs w:val="24"/>
+        </w:rPr>
+        <w:t>PeerJ</w:t>
       </w:r>
       <w:r>
         <w:rPr>
@@ -8943,15 +9151,15 @@
           <w:sz w:val="24"/>
           <w:szCs w:val="24"/>
         </w:rPr>
-        <w:t>25</w:t>
-      </w:r>
-      <w:r>
-        <w:rPr>
-          <w:rFonts w:ascii="Times New Roman" w:eastAsia="Times New Roman" w:hAnsi="Times New Roman" w:cs="Times New Roman"/>
-          <w:sz w:val="24"/>
-          <w:szCs w:val="24"/>
-        </w:rPr>
-        <w:t xml:space="preserve">(9), 1085–1096. https://doi.org/10.1111/geb.12468 </w:t>
+        <w:t>9</w:t>
+      </w:r>
+      <w:r>
+        <w:rPr>
+          <w:rFonts w:ascii="Times New Roman" w:eastAsia="Times New Roman" w:hAnsi="Times New Roman" w:cs="Times New Roman"/>
+          <w:sz w:val="24"/>
+          <w:szCs w:val="24"/>
+        </w:rPr>
+        <w:t>, e11673. https://doi.org/10.7717/peerj.11673</w:t>
       </w:r>
     </w:p>
     <w:p>
@@ -8977,6 +9185,66 @@
           <w:sz w:val="24"/>
           <w:szCs w:val="24"/>
         </w:rPr>
+        <w:t xml:space="preserve">Stropp, J., Ladle, R. J., M. Malhado, A. C., Hortal, J., Gaffuri, J., H. Temperley, W., Olav Skøien, J., &amp; Mayaux, P. (2016). Mapping ignorance: 300 years of collecting flowering plants in Africa. </w:t>
+      </w:r>
+      <w:r>
+        <w:rPr>
+          <w:rFonts w:ascii="Times New Roman" w:eastAsia="Times New Roman" w:hAnsi="Times New Roman" w:cs="Times New Roman"/>
+          <w:i/>
+          <w:sz w:val="24"/>
+          <w:szCs w:val="24"/>
+        </w:rPr>
+        <w:t>Global Ecology and Biogeography</w:t>
+      </w:r>
+      <w:r>
+        <w:rPr>
+          <w:rFonts w:ascii="Times New Roman" w:eastAsia="Times New Roman" w:hAnsi="Times New Roman" w:cs="Times New Roman"/>
+          <w:sz w:val="24"/>
+          <w:szCs w:val="24"/>
+        </w:rPr>
+        <w:t xml:space="preserve">, </w:t>
+      </w:r>
+      <w:r>
+        <w:rPr>
+          <w:rFonts w:ascii="Times New Roman" w:eastAsia="Times New Roman" w:hAnsi="Times New Roman" w:cs="Times New Roman"/>
+          <w:i/>
+          <w:sz w:val="24"/>
+          <w:szCs w:val="24"/>
+        </w:rPr>
+        <w:t>25</w:t>
+      </w:r>
+      <w:r>
+        <w:rPr>
+          <w:rFonts w:ascii="Times New Roman" w:eastAsia="Times New Roman" w:hAnsi="Times New Roman" w:cs="Times New Roman"/>
+          <w:sz w:val="24"/>
+          <w:szCs w:val="24"/>
+        </w:rPr>
+        <w:t xml:space="preserve">(9), 1085–1096. https://doi.org/10.1111/geb.12468 </w:t>
+      </w:r>
+    </w:p>
+    <w:p>
+      <w:pPr>
+        <w:pBdr>
+          <w:top w:val="nil"/>
+          <w:left w:val="nil"/>
+          <w:bottom w:val="nil"/>
+          <w:right w:val="nil"/>
+          <w:between w:val="nil"/>
+        </w:pBdr>
+        <w:spacing w:after="0"/>
+        <w:ind w:left="720" w:hanging="720"/>
+        <w:rPr>
+          <w:rFonts w:ascii="Times New Roman" w:eastAsia="Times New Roman" w:hAnsi="Times New Roman" w:cs="Times New Roman"/>
+          <w:sz w:val="24"/>
+          <w:szCs w:val="24"/>
+        </w:rPr>
+      </w:pPr>
+      <w:r>
+        <w:rPr>
+          <w:rFonts w:ascii="Times New Roman" w:eastAsia="Times New Roman" w:hAnsi="Times New Roman" w:cs="Times New Roman"/>
+          <w:sz w:val="24"/>
+          <w:szCs w:val="24"/>
+        </w:rPr>
         <w:t xml:space="preserve">Stropp, J., Umbelino, B., Correia, R. A., Campos‐Silva, J. V., Ladle, R. J., &amp; Malhado, A. C. M. (2020). The ghosts of forests past and future: Deforestation and botanical sampling in the Brazilian Amazon. </w:t>
       </w:r>
       <w:r>
@@ -9013,6 +9281,52 @@
         </w:rPr>
         <w:t>(7), 979–989. https://doi.org/10.1111/ecog.05026</w:t>
       </w:r>
+    </w:p>
+    <w:p>
+      <w:pPr>
+        <w:pBdr>
+          <w:top w:val="nil"/>
+          <w:left w:val="nil"/>
+          <w:bottom w:val="nil"/>
+          <w:right w:val="nil"/>
+          <w:between w:val="nil"/>
+        </w:pBdr>
+        <w:spacing w:after="0"/>
+        <w:ind w:left="720" w:hanging="720"/>
+        <w:rPr>
+          <w:ins w:id="202" w:author="Maria Carmona-Higuita" w:date="2026-08-06T00:00:00Z"/>
+          <w:rFonts w:ascii="Times New Roman" w:eastAsia="Times New Roman" w:hAnsi="Times New Roman" w:cs="Times New Roman"/>
+          <w:sz w:val="24"/>
+          <w:szCs w:val="24"/>
+        </w:rPr>
+      </w:pPr>
+      <w:ins w:id="203" w:author="Maria Carmona-Higuita" w:date="2026-08-06T00:00:00Z">
+        <w:r>
+          <w:rPr>
+            <w:rFonts w:ascii="Times New Roman" w:eastAsia="Times New Roman" w:hAnsi="Times New Roman" w:cs="Times New Roman"/>
+            <w:sz w:val="24"/>
+            <w:szCs w:val="24"/>
+          </w:rPr>
+          <w:t xml:space="preserve">Svahnström, V. J., Nic Lughadha, E., Forest, F., &amp; Leão, T. C. C. (2025). Geographic range size and rarity of epiphytic flowering plants. </w:t>
+        </w:r>
+        <w:r>
+          <w:rPr>
+            <w:rFonts w:ascii="Times New Roman" w:eastAsia="Times New Roman" w:hAnsi="Times New Roman" w:cs="Times New Roman"/>
+            <w:i/>
+            <w:sz w:val="24"/>
+            <w:szCs w:val="24"/>
+          </w:rPr>
+          <w:t xml:space="preserve">Nature Plants</w:t>
+        </w:r>
+        <w:r>
+          <w:rPr>
+            <w:rFonts w:ascii="Times New Roman" w:eastAsia="Times New Roman" w:hAnsi="Times New Roman" w:cs="Times New Roman"/>
+            <w:sz w:val="24"/>
+            <w:szCs w:val="24"/>
+          </w:rPr>
+          <w:t xml:space="preserve">. https://doi.org/10.1038/s41477-025-02022-9</w:t>
+        </w:r>
+      </w:ins>
     </w:p>
     <w:p>
       <w:pPr>

</xml_diff>